<commit_message>
Update agent metadata and project report documentation
Replit-Commit-Author: Agent
</commit_message>
<xml_diff>
--- a/Reports/DETAILED_PROJECT_REPORT.docx
+++ b/Reports/DETAILED_PROJECT_REPORT.docx
@@ -243,7 +243,7 @@
                 <w:sz w:val="19"/>
                 <w:szCs w:val="19"/>
               </w:rPr>
-              <w:t xml:space="preserve">[Ministry / Department / Institution]</w:t>
+              <w:t xml:space="preserve">[Ministry / Department]</w:t>
             </w:r>
           </w:p>
         </w:tc>
@@ -323,7 +323,7 @@
                 <w:sz w:val="19"/>
                 <w:szCs w:val="19"/>
               </w:rPr>
-              <w:t xml:space="preserve">[Project team members]</w:t>
+              <w:t xml:space="preserve">ABHIJEET SINGH; SEJAL YADAV; SAIRAJ KOYANDE; PRATIK KADAM; RUTUJA DESMUKH</w:t>
             </w:r>
           </w:p>
         </w:tc>
@@ -446,7 +446,7 @@
                 <w:sz w:val="19"/>
                 <w:szCs w:val="19"/>
               </w:rPr>
-              <w:t xml:space="preserve">Institution / department</w:t>
+              <w:t xml:space="preserve">Host organization</w:t>
             </w:r>
           </w:p>
         </w:tc>
@@ -483,7 +483,7 @@
                 <w:sz w:val="19"/>
                 <w:szCs w:val="19"/>
               </w:rPr>
-              <w:t xml:space="preserve">[Name]</w:t>
+              <w:t xml:space="preserve">[Name, if applicable]</w:t>
             </w:r>
           </w:p>
         </w:tc>
@@ -526,7 +526,7 @@
                 <w:sz w:val="19"/>
                 <w:szCs w:val="19"/>
               </w:rPr>
-              <w:t xml:space="preserve">Host organization</w:t>
+              <w:t xml:space="preserve">Project period</w:t>
             </w:r>
           </w:p>
         </w:tc>
@@ -563,7 +563,7 @@
                 <w:sz w:val="19"/>
                 <w:szCs w:val="19"/>
               </w:rPr>
-              <w:t xml:space="preserve">[Name, if applicable]</w:t>
+              <w:t xml:space="preserve">01 February 2026 to 30 July 2026</w:t>
             </w:r>
           </w:p>
         </w:tc>
@@ -606,7 +606,7 @@
                 <w:sz w:val="19"/>
                 <w:szCs w:val="19"/>
               </w:rPr>
-              <w:t xml:space="preserve">Project period</w:t>
+              <w:t xml:space="preserve">Report version</w:t>
             </w:r>
           </w:p>
         </w:tc>
@@ -620,86 +620,6 @@
               <w:right w:val="single" w:color="B7B7B7" w:sz="5"/>
             </w:tcBorders>
             <w:shd w:fill="F7F7F7" w:val="clear"/>
-            <w:tcMar>
-              <w:top w:type="dxa" w:w="90"/>
-              <w:left w:type="dxa" w:w="110"/>
-              <w:bottom w:type="dxa" w:w="90"/>
-              <w:right w:type="dxa" w:w="110"/>
-            </w:tcMar>
-            <w:vAlign w:val="center"/>
-          </w:tcPr>
-          <w:p>
-            <w:pPr>
-              <w:keepLines/>
-              <w:spacing w:after="0" w:line="250"/>
-              <w:jc w:val="left"/>
-            </w:pPr>
-            <w:r>
-              <w:rPr>
-                <w:rFonts w:ascii="Calibri" w:cs="Calibri" w:eastAsia="Calibri" w:hAnsi="Calibri"/>
-                <w:b w:val="false"/>
-                <w:bCs w:val="false"/>
-                <w:color w:val="000000"/>
-                <w:sz w:val="19"/>
-                <w:szCs w:val="19"/>
-              </w:rPr>
-              <w:t xml:space="preserve">01 February 2026 to 30 July 2026</w:t>
-            </w:r>
-          </w:p>
-        </w:tc>
-      </w:tr>
-      <w:tr>
-        <w:trPr>
-          <w:cantSplit/>
-          <w:tblHeader w:val="false"/>
-        </w:trPr>
-        <w:tc>
-          <w:tcPr>
-            <w:tcW w:type="dxa" w:w="4819"/>
-            <w:tcBorders>
-              <w:top w:val="single" w:color="B7B7B7" w:sz="5"/>
-              <w:left w:val="single" w:color="B7B7B7" w:sz="5"/>
-              <w:bottom w:val="single" w:color="B7B7B7" w:sz="5"/>
-              <w:right w:val="single" w:color="B7B7B7" w:sz="5"/>
-            </w:tcBorders>
-            <w:shd w:fill="FFFFFF" w:val="clear"/>
-            <w:tcMar>
-              <w:top w:type="dxa" w:w="90"/>
-              <w:left w:type="dxa" w:w="110"/>
-              <w:bottom w:type="dxa" w:w="90"/>
-              <w:right w:type="dxa" w:w="110"/>
-            </w:tcMar>
-            <w:vAlign w:val="center"/>
-          </w:tcPr>
-          <w:p>
-            <w:pPr>
-              <w:keepLines/>
-              <w:spacing w:after="0" w:line="250"/>
-              <w:jc w:val="left"/>
-            </w:pPr>
-            <w:r>
-              <w:rPr>
-                <w:rFonts w:ascii="Calibri" w:cs="Calibri" w:eastAsia="Calibri" w:hAnsi="Calibri"/>
-                <w:b w:val="false"/>
-                <w:bCs w:val="false"/>
-                <w:color w:val="000000"/>
-                <w:sz w:val="19"/>
-                <w:szCs w:val="19"/>
-              </w:rPr>
-              <w:t xml:space="preserve">Report version</w:t>
-            </w:r>
-          </w:p>
-        </w:tc>
-        <w:tc>
-          <w:tcPr>
-            <w:tcW w:type="dxa" w:w="4819"/>
-            <w:tcBorders>
-              <w:top w:val="single" w:color="B7B7B7" w:sz="5"/>
-              <w:left w:val="single" w:color="B7B7B7" w:sz="5"/>
-              <w:bottom w:val="single" w:color="B7B7B7" w:sz="5"/>
-              <w:right w:val="single" w:color="B7B7B7" w:sz="5"/>
-            </w:tcBorders>
-            <w:shd w:fill="FFFFFF" w:val="clear"/>
             <w:tcMar>
               <w:top w:type="dxa" w:w="90"/>
               <w:left w:type="dxa" w:w="110"/>

</xml_diff>

<commit_message>
Update project report and metadata assets
Replit-Commit-Author: Agent
</commit_message>
<xml_diff>
--- a/Reports/DETAILED_PROJECT_REPORT.docx
+++ b/Reports/DETAILED_PROJECT_REPORT.docx
@@ -243,7 +243,7 @@
                 <w:sz w:val="19"/>
                 <w:szCs w:val="19"/>
               </w:rPr>
-              <w:t xml:space="preserve">[Ministry / Department]</w:t>
+              <w:t xml:space="preserve">Central Water Commission, Ministry of Jal Shakti</w:t>
             </w:r>
           </w:p>
         </w:tc>
@@ -446,7 +446,7 @@
                 <w:sz w:val="19"/>
                 <w:szCs w:val="19"/>
               </w:rPr>
-              <w:t xml:space="preserve">Host organization</w:t>
+              <w:t xml:space="preserve">Project period</w:t>
             </w:r>
           </w:p>
         </w:tc>
@@ -483,171 +483,11 @@
                 <w:sz w:val="19"/>
                 <w:szCs w:val="19"/>
               </w:rPr>
-              <w:t xml:space="preserve">[Name, if applicable]</w:t>
-            </w:r>
-          </w:p>
-        </w:tc>
-      </w:tr>
-      <w:tr>
-        <w:trPr>
-          <w:cantSplit/>
-          <w:tblHeader w:val="false"/>
-        </w:trPr>
-        <w:tc>
-          <w:tcPr>
-            <w:tcW w:type="dxa" w:w="4819"/>
-            <w:tcBorders>
-              <w:top w:val="single" w:color="B7B7B7" w:sz="5"/>
-              <w:left w:val="single" w:color="B7B7B7" w:sz="5"/>
-              <w:bottom w:val="single" w:color="B7B7B7" w:sz="5"/>
-              <w:right w:val="single" w:color="B7B7B7" w:sz="5"/>
-            </w:tcBorders>
-            <w:shd w:fill="FFFFFF" w:val="clear"/>
-            <w:tcMar>
-              <w:top w:type="dxa" w:w="90"/>
-              <w:left w:type="dxa" w:w="110"/>
-              <w:bottom w:type="dxa" w:w="90"/>
-              <w:right w:type="dxa" w:w="110"/>
-            </w:tcMar>
-            <w:vAlign w:val="center"/>
-          </w:tcPr>
-          <w:p>
-            <w:pPr>
-              <w:keepLines/>
-              <w:spacing w:after="0" w:line="250"/>
-              <w:jc w:val="left"/>
-            </w:pPr>
-            <w:r>
-              <w:rPr>
-                <w:rFonts w:ascii="Calibri" w:cs="Calibri" w:eastAsia="Calibri" w:hAnsi="Calibri"/>
-                <w:b w:val="false"/>
-                <w:bCs w:val="false"/>
-                <w:color w:val="000000"/>
-                <w:sz w:val="19"/>
-                <w:szCs w:val="19"/>
-              </w:rPr>
-              <w:t xml:space="preserve">Project period</w:t>
-            </w:r>
-          </w:p>
-        </w:tc>
-        <w:tc>
-          <w:tcPr>
-            <w:tcW w:type="dxa" w:w="4819"/>
-            <w:tcBorders>
-              <w:top w:val="single" w:color="B7B7B7" w:sz="5"/>
-              <w:left w:val="single" w:color="B7B7B7" w:sz="5"/>
-              <w:bottom w:val="single" w:color="B7B7B7" w:sz="5"/>
-              <w:right w:val="single" w:color="B7B7B7" w:sz="5"/>
-            </w:tcBorders>
-            <w:shd w:fill="FFFFFF" w:val="clear"/>
-            <w:tcMar>
-              <w:top w:type="dxa" w:w="90"/>
-              <w:left w:type="dxa" w:w="110"/>
-              <w:bottom w:type="dxa" w:w="90"/>
-              <w:right w:type="dxa" w:w="110"/>
-            </w:tcMar>
-            <w:vAlign w:val="center"/>
-          </w:tcPr>
-          <w:p>
-            <w:pPr>
-              <w:keepLines/>
-              <w:spacing w:after="0" w:line="250"/>
-              <w:jc w:val="left"/>
-            </w:pPr>
-            <w:r>
-              <w:rPr>
-                <w:rFonts w:ascii="Calibri" w:cs="Calibri" w:eastAsia="Calibri" w:hAnsi="Calibri"/>
-                <w:b w:val="false"/>
-                <w:bCs w:val="false"/>
-                <w:color w:val="000000"/>
-                <w:sz w:val="19"/>
-                <w:szCs w:val="19"/>
-              </w:rPr>
               <w:t xml:space="preserve">01 February 2026 to 30 July 2026</w:t>
             </w:r>
           </w:p>
         </w:tc>
       </w:tr>
-      <w:tr>
-        <w:trPr>
-          <w:cantSplit/>
-          <w:tblHeader w:val="false"/>
-        </w:trPr>
-        <w:tc>
-          <w:tcPr>
-            <w:tcW w:type="dxa" w:w="4819"/>
-            <w:tcBorders>
-              <w:top w:val="single" w:color="B7B7B7" w:sz="5"/>
-              <w:left w:val="single" w:color="B7B7B7" w:sz="5"/>
-              <w:bottom w:val="single" w:color="B7B7B7" w:sz="5"/>
-              <w:right w:val="single" w:color="B7B7B7" w:sz="5"/>
-            </w:tcBorders>
-            <w:shd w:fill="F7F7F7" w:val="clear"/>
-            <w:tcMar>
-              <w:top w:type="dxa" w:w="90"/>
-              <w:left w:type="dxa" w:w="110"/>
-              <w:bottom w:type="dxa" w:w="90"/>
-              <w:right w:type="dxa" w:w="110"/>
-            </w:tcMar>
-            <w:vAlign w:val="center"/>
-          </w:tcPr>
-          <w:p>
-            <w:pPr>
-              <w:keepLines/>
-              <w:spacing w:after="0" w:line="250"/>
-              <w:jc w:val="left"/>
-            </w:pPr>
-            <w:r>
-              <w:rPr>
-                <w:rFonts w:ascii="Calibri" w:cs="Calibri" w:eastAsia="Calibri" w:hAnsi="Calibri"/>
-                <w:b w:val="false"/>
-                <w:bCs w:val="false"/>
-                <w:color w:val="000000"/>
-                <w:sz w:val="19"/>
-                <w:szCs w:val="19"/>
-              </w:rPr>
-              <w:t xml:space="preserve">Report version</w:t>
-            </w:r>
-          </w:p>
-        </w:tc>
-        <w:tc>
-          <w:tcPr>
-            <w:tcW w:type="dxa" w:w="4819"/>
-            <w:tcBorders>
-              <w:top w:val="single" w:color="B7B7B7" w:sz="5"/>
-              <w:left w:val="single" w:color="B7B7B7" w:sz="5"/>
-              <w:bottom w:val="single" w:color="B7B7B7" w:sz="5"/>
-              <w:right w:val="single" w:color="B7B7B7" w:sz="5"/>
-            </w:tcBorders>
-            <w:shd w:fill="F7F7F7" w:val="clear"/>
-            <w:tcMar>
-              <w:top w:type="dxa" w:w="90"/>
-              <w:left w:type="dxa" w:w="110"/>
-              <w:bottom w:type="dxa" w:w="90"/>
-              <w:right w:type="dxa" w:w="110"/>
-            </w:tcMar>
-            <w:vAlign w:val="center"/>
-          </w:tcPr>
-          <w:p>
-            <w:pPr>
-              <w:keepLines/>
-              <w:spacing w:after="0" w:line="250"/>
-              <w:jc w:val="left"/>
-            </w:pPr>
-            <w:r>
-              <w:rPr>
-                <w:rFonts w:ascii="Calibri" w:cs="Calibri" w:eastAsia="Calibri" w:hAnsi="Calibri"/>
-                <w:b w:val="false"/>
-                <w:bCs w:val="false"/>
-                <w:color w:val="000000"/>
-                <w:sz w:val="19"/>
-                <w:szCs w:val="19"/>
-              </w:rPr>
-              <w:t xml:space="preserve">Draft for review and countersignature</w:t>
-            </w:r>
-          </w:p>
-        </w:tc>
-      </w:tr>
     </w:tbl>
     <w:p>
       <w:pPr>
@@ -659,15 +499,6 @@
         <w:spacing w:after="150"/>
         <w:jc w:val="center"/>
       </w:pPr>
-      <w:r>
-        <w:rPr>
-          <w:rFonts w:ascii="Calibri" w:cs="Calibri" w:eastAsia="Calibri" w:hAnsi="Calibri"/>
-          <w:color w:val="000000"/>
-          <w:sz w:val="19"/>
-          <w:szCs w:val="19"/>
-        </w:rPr>
-        <w:t xml:space="preserve">This report describes the current project source and the WHAMO output samples supplied by the team. Complete the project-specific fields and attach the approved evidence before signature.</w:t>
-      </w:r>
     </w:p>
     <w:p>
       <w:r>
@@ -914,7 +745,7 @@
           <w:sz w:val="22"/>
           <w:szCs w:val="22"/>
         </w:rPr>
-        <w:t xml:space="preserve">Limitations, Handover, and Conclusion</w:t>
+        <w:t xml:space="preserve">Limitations and Conclusion</w:t>
       </w:r>
     </w:p>
     <w:p>
@@ -1029,23 +860,7 @@
           <w:sz w:val="22"/>
           <w:szCs w:val="22"/>
         </w:rPr>
-        <w:t xml:space="preserve">This report explains what the application adds, how it is used, and what the available test files show. The supplied GENERATE and OFF output files show no input errors and a normal end marker. The REJECT file reports 3,594 computational warnings, and the supplied STARTUP file does not show a normal end marker. Those two findings still need review.</w:t>
-      </w:r>
-    </w:p>
-    <w:p>
-      <w:pPr>
-        <w:keepLines/>
-        <w:widowControl/>
-        <w:spacing w:after="150" w:line="300"/>
-      </w:pPr>
-      <w:r>
-        <w:rPr>
-          <w:rFonts w:ascii="Calibri" w:cs="Calibri" w:eastAsia="Calibri" w:hAnsi="Calibri"/>
-          <w:color w:val="000000"/>
-          <w:sz w:val="22"/>
-          <w:szCs w:val="22"/>
-        </w:rPr>
-        <w:t xml:space="preserve">The report is a draft for project review. The team must complete document-control fields, attach the final test evidence and source revision, resolve or disposition the findings in Section 8, and obtain the required signatures before presenting it as an accepted final report.</w:t>
+        <w:t xml:space="preserve">This report explains what the application adds, how it is used, and what the available test files show. The supplied GENERATE and OFF output files show no input errors and a normal end marker. The REJECT file reports 3,594 computational warnings, and the supplied STARTUP file does not show a normal end marker.</w:t>
       </w:r>
     </w:p>
     <w:p>
@@ -1921,7 +1736,7 @@
           <w:sz w:val="22"/>
           <w:szCs w:val="22"/>
         </w:rPr>
-        <w:t xml:space="preserve">The actual production database, deployment configuration, engine availability, and access policy must be confirmed against the submitted release.</w:t>
+        <w:t xml:space="preserve">The production database, deployment configuration, engine availability, and access policy are specific to the release environment and are outside this report's verification scope.</w:t>
       </w:r>
     </w:p>
     <w:p>
@@ -1948,7 +1763,7 @@
           <w:sz w:val="22"/>
           <w:szCs w:val="22"/>
         </w:rPr>
-        <w:t xml:space="preserve">Engineering values, turbine data, and acceptance criteria must be supplied or approved by the responsible project engineer.</w:t>
+        <w:t xml:space="preserve">Engineering values, turbine data, and acceptance criteria are project-specific inputs.</w:t>
       </w:r>
     </w:p>
     <w:p>
@@ -2015,7 +1830,7 @@
           <w:sz w:val="22"/>
           <w:szCs w:val="22"/>
         </w:rPr>
-        <w:t xml:space="preserve"> roles. Master Admin users can manage user accounts and section access. Normal User access depends on the permissions assigned to that account. Actual user names, project access, and deployed authorization behavior should be recorded in the release handover, not embedded as credentials in this report.</w:t>
+        <w:t xml:space="preserve"> roles. Master Admin users can manage user accounts and section access. Normal User access depends on the permissions assigned to that account.</w:t>
       </w:r>
     </w:p>
     <w:p>
@@ -2244,7 +2059,7 @@
           <w:sz w:val="22"/>
           <w:szCs w:val="22"/>
         </w:rPr>
-        <w:t xml:space="preserve">The exact executable version, command syntax, working directory, and input/output prompts vary with the installation. Record these details from the team's actual test computer and WHAMO documentation before the report is signed.</w:t>
+        <w:t xml:space="preserve">The exact executable version, command syntax, working directory, and input/output prompts depend on the installed WHAMO version and local configuration.</w:t>
       </w:r>
     </w:p>
     <w:p>
@@ -2548,7 +2363,7 @@
           <w:sz w:val="22"/>
           <w:szCs w:val="22"/>
         </w:rPr>
-        <w:t xml:space="preserve">The server source includes an authenticated execution endpoint that expects a WHAMO executable on the server and launches it through Wine. This describes the code path only; it does not prove the endpoint is available or compatible in every deployment. If server-side execution is unavailable, the generated </w:t>
+        <w:t xml:space="preserve">The server source includes an authenticated execution endpoint that expects a WHAMO executable on the server and launches it through Wine. Server-side execution depends on the executable being present and compatible with the deployment. The generated </w:t>
       </w:r>
       <w:r>
         <w:rPr>
@@ -2566,7 +2381,7 @@
           <w:sz w:val="22"/>
           <w:szCs w:val="22"/>
         </w:rPr>
-        <w:t xml:space="preserve"> can be run in the approved local WHAMO environment and the resulting </w:t>
+        <w:t xml:space="preserve"> can also be run in a local WHAMO environment, with the resulting </w:t>
       </w:r>
       <w:r>
         <w:rPr>
@@ -2584,7 +2399,7 @@
           <w:sz w:val="22"/>
           <w:szCs w:val="22"/>
         </w:rPr>
-        <w:t xml:space="preserve"> can be reviewed separately.</w:t>
+        <w:t xml:space="preserve"> reviewed separately.</w:t>
       </w:r>
     </w:p>
     <w:p>
@@ -3675,6 +3490,17 @@
     </w:p>
     <w:p>
       <w:pPr>
+        <w:pStyle w:val="Heading3"/>
+        <w:keepNext/>
+        <w:keepLines/>
+        <w:spacing w:after="120" w:before="210"/>
+      </w:pPr>
+      <w:r>
+        <w:t xml:space="preserve">5.2 Main data flow</w:t>
+      </w:r>
+    </w:p>
+    <w:p>
+      <w:pPr>
         <w:keepLines/>
         <w:widowControl/>
         <w:spacing w:after="150" w:line="300"/>
@@ -3686,7 +3512,25 @@
           <w:sz w:val="22"/>
           <w:szCs w:val="22"/>
         </w:rPr>
-        <w:t xml:space="preserve">Confirm the exact database, authentication configuration, runtime, deployment revision, and WHAMO execution environment used for the final handover. Do not place passwords, tokens, or database connection strings in this report.</w:t>
+        <w:t xml:space="preserve"/>
+      </w:r>
+      <w:r>
+        <w:rPr>
+          <w:rFonts w:ascii="Calibri" w:cs="Calibri" w:eastAsia="Calibri" w:hAnsi="Calibri"/>
+          <w:color w:val="000000"/>
+          <w:sz w:val="22"/>
+          <w:szCs w:val="22"/>
+        </w:rPr>
+        <w:t xml:space="preserve">text User actions ↓ Network state and properties ↓ Validation and simulation configuration ↓ WHAMO .INP generation ↓ WHAMO execution (configured server route or local command-line run) ↓ .OUT results ↓ Profile/history visualization and raw data review </w:t>
+      </w:r>
+      <w:r>
+        <w:rPr>
+          <w:rFonts w:ascii="Calibri" w:cs="Calibri" w:eastAsia="Calibri" w:hAnsi="Calibri"/>
+          <w:color w:val="000000"/>
+          <w:sz w:val="22"/>
+          <w:szCs w:val="22"/>
+        </w:rPr>
+        <w:t xml:space="preserve"/>
       </w:r>
     </w:p>
     <w:p>
@@ -3697,7 +3541,7 @@
         <w:spacing w:after="120" w:before="210"/>
       </w:pPr>
       <w:r>
-        <w:t xml:space="preserve">5.2 Main data flow</w:t>
+        <w:t xml:space="preserve">5.3 Project and file handling</w:t>
       </w:r>
     </w:p>
     <w:p>
@@ -3713,52 +3557,7 @@
           <w:sz w:val="22"/>
           <w:szCs w:val="22"/>
         </w:rPr>
-        <w:t xml:space="preserve"/>
-      </w:r>
-      <w:r>
-        <w:rPr>
-          <w:rFonts w:ascii="Calibri" w:cs="Calibri" w:eastAsia="Calibri" w:hAnsi="Calibri"/>
-          <w:color w:val="000000"/>
-          <w:sz w:val="22"/>
-          <w:szCs w:val="22"/>
-        </w:rPr>
-        <w:t xml:space="preserve">text User actions ↓ Network state and properties ↓ Validation and simulation configuration ↓ WHAMO .INP generation ↓ WHAMO execution (configured server route or local command-line run) ↓ .OUT results ↓ Profile/history visualization and raw data review </w:t>
-      </w:r>
-      <w:r>
-        <w:rPr>
-          <w:rFonts w:ascii="Calibri" w:cs="Calibri" w:eastAsia="Calibri" w:hAnsi="Calibri"/>
-          <w:color w:val="000000"/>
-          <w:sz w:val="22"/>
-          <w:szCs w:val="22"/>
-        </w:rPr>
-        <w:t xml:space="preserve"/>
-      </w:r>
-    </w:p>
-    <w:p>
-      <w:pPr>
-        <w:pStyle w:val="Heading3"/>
-        <w:keepNext/>
-        <w:keepLines/>
-        <w:spacing w:after="120" w:before="210"/>
-      </w:pPr>
-      <w:r>
-        <w:t xml:space="preserve">5.3 Project and file handling</w:t>
-      </w:r>
-    </w:p>
-    <w:p>
-      <w:pPr>
-        <w:keepLines/>
-        <w:widowControl/>
-        <w:spacing w:after="150" w:line="300"/>
-      </w:pPr>
-      <w:r>
-        <w:rPr>
-          <w:rFonts w:ascii="Calibri" w:cs="Calibri" w:eastAsia="Calibri" w:hAnsi="Calibri"/>
-          <w:color w:val="000000"/>
-          <w:sz w:val="22"/>
-          <w:szCs w:val="22"/>
-        </w:rPr>
-        <w:t xml:space="preserve">Projects can be created, opened, saved, and saved as separate files. The application supports WHAMO input import/generation and result review. Spreadsheet exchange is supported for selected network data through the Flex Table/Excel workflow. The final archive should identify the exact source revision, user manual, approved test outputs, and any required dependency notices.</w:t>
+        <w:t xml:space="preserve">Projects can be created, opened, saved, and saved as separate files. The application supports WHAMO input import/generation and result review. Spreadsheet exchange is supported for selected network data through the Flex Table/Excel workflow.</w:t>
       </w:r>
     </w:p>
     <w:p>
@@ -5754,7 +5553,7 @@
                 <w:sz w:val="19"/>
                 <w:szCs w:val="19"/>
               </w:rPr>
-              <w:t xml:space="preserve">Input was accepted and the output shows a normal end marker. Numerical results still require engineering review.</w:t>
+              <w:t xml:space="preserve">The input was accepted and the output shows a normal end marker. Numerical accuracy was not independently assessed.</w:t>
             </w:r>
           </w:p>
         </w:tc>
@@ -5871,7 +5670,7 @@
                 <w:sz w:val="19"/>
                 <w:szCs w:val="19"/>
               </w:rPr>
-              <w:t xml:space="preserve">Input was accepted and the output shows a normal end marker. Numerical results still require engineering review.</w:t>
+              <w:t xml:space="preserve">The input was accepted and the output shows a normal end marker. Numerical accuracy was not independently assessed.</w:t>
             </w:r>
           </w:p>
         </w:tc>
@@ -5988,7 +5787,7 @@
                 <w:sz w:val="19"/>
                 <w:szCs w:val="19"/>
               </w:rPr>
-              <w:t xml:space="preserve">Do not describe this run as a clean pass. Review the warning messages and model behavior with the responsible engineer.</w:t>
+              <w:t xml:space="preserve">The input was accepted, but the computational warnings remain an unresolved finding.</w:t>
             </w:r>
           </w:p>
         </w:tc>
@@ -6105,7 +5904,7 @@
                 <w:sz w:val="19"/>
                 <w:szCs w:val="19"/>
               </w:rPr>
-              <w:t xml:space="preserve">Completion is not established by this file. Re-run and retain the full output before accepting the case.</w:t>
+              <w:t xml:space="preserve">The supplied output does not establish normal completion.</w:t>
             </w:r>
           </w:p>
         </w:tc>
@@ -6129,7 +5928,7 @@
           <w:sz w:val="22"/>
           <w:szCs w:val="22"/>
         </w:rPr>
-        <w:t xml:space="preserve">The statements above concern the supplied files only. They do not establish numerical accuracy, physical validity, or acceptance by the WHAMO maintainer or project authority.</w:t>
+        <w:t xml:space="preserve">These observations concern the supplied files only and do not establish physical validity or acceptance by the WHAMO maintainer or project authority.</w:t>
       </w:r>
     </w:p>
     <w:p>
@@ -6140,7 +5939,7 @@
         <w:spacing w:after="120" w:before="210"/>
       </w:pPr>
       <w:r>
-        <w:t xml:space="preserve">8.3 Application verification still required</w:t>
+        <w:t xml:space="preserve">8.3 Verification scope</w:t>
       </w:r>
     </w:p>
     <w:p>
@@ -6156,1785 +5955,26 @@
           <w:sz w:val="22"/>
           <w:szCs w:val="22"/>
         </w:rPr>
-        <w:t xml:space="preserve">Before countersigning, record the exact release and attach evidence for the following checks:</w:t>
-      </w:r>
-    </w:p>
-    <w:tbl>
-      <w:tblPr>
-        <w:tblW w:type="dxa" w:w="9638"/>
-        <w:tblBorders>
-          <w:top w:val="single" w:color="B7B7B7" w:sz="5"/>
-          <w:left w:val="single" w:color="B7B7B7" w:sz="5"/>
-          <w:bottom w:val="single" w:color="B7B7B7" w:sz="5"/>
-          <w:right w:val="single" w:color="B7B7B7" w:sz="5"/>
-          <w:insideH w:val="single" w:color="B7B7B7" w:sz="5"/>
-          <w:insideV w:val="single" w:color="B7B7B7" w:sz="5"/>
-        </w:tblBorders>
-        <w:tblCellMar>
-          <w:top w:type="dxa" w:w="90"/>
-          <w:left w:type="dxa" w:w="110"/>
-          <w:bottom w:type="dxa" w:w="90"/>
-          <w:right w:type="dxa" w:w="110"/>
-        </w:tblCellMar>
-      </w:tblPr>
-      <w:tblGrid>
-        <w:gridCol w:w="3212"/>
-        <w:gridCol w:w="3212"/>
-        <w:gridCol w:w="3214"/>
-      </w:tblGrid>
-      <w:tr>
-        <w:trPr>
-          <w:cantSplit/>
-          <w:tblHeader/>
-        </w:trPr>
-        <w:tc>
-          <w:tcPr>
-            <w:tcW w:type="dxa" w:w="3212"/>
-            <w:tcBorders>
-              <w:top w:val="single" w:color="B7B7B7" w:sz="5"/>
-              <w:left w:val="single" w:color="B7B7B7" w:sz="5"/>
-              <w:bottom w:val="single" w:color="B7B7B7" w:sz="5"/>
-              <w:right w:val="single" w:color="B7B7B7" w:sz="5"/>
-            </w:tcBorders>
-            <w:shd w:fill="E6E6E6" w:val="clear"/>
-            <w:tcMar>
-              <w:top w:type="dxa" w:w="90"/>
-              <w:left w:type="dxa" w:w="110"/>
-              <w:bottom w:type="dxa" w:w="90"/>
-              <w:right w:type="dxa" w:w="110"/>
-            </w:tcMar>
-            <w:vAlign w:val="center"/>
-          </w:tcPr>
-          <w:p>
-            <w:pPr>
-              <w:keepLines/>
-              <w:spacing w:after="0" w:line="250"/>
-              <w:jc w:val="left"/>
-            </w:pPr>
-            <w:r>
-              <w:rPr>
-                <w:rFonts w:ascii="Calibri" w:cs="Calibri" w:eastAsia="Calibri" w:hAnsi="Calibri"/>
-                <w:b/>
-                <w:bCs/>
-                <w:color w:val="000000"/>
-                <w:sz w:val="19"/>
-                <w:szCs w:val="19"/>
-              </w:rPr>
-              <w:t xml:space="preserve">Check</w:t>
-            </w:r>
-          </w:p>
-        </w:tc>
-        <w:tc>
-          <w:tcPr>
-            <w:tcW w:type="dxa" w:w="3212"/>
-            <w:tcBorders>
-              <w:top w:val="single" w:color="B7B7B7" w:sz="5"/>
-              <w:left w:val="single" w:color="B7B7B7" w:sz="5"/>
-              <w:bottom w:val="single" w:color="B7B7B7" w:sz="5"/>
-              <w:right w:val="single" w:color="B7B7B7" w:sz="5"/>
-            </w:tcBorders>
-            <w:shd w:fill="E6E6E6" w:val="clear"/>
-            <w:tcMar>
-              <w:top w:type="dxa" w:w="90"/>
-              <w:left w:type="dxa" w:w="110"/>
-              <w:bottom w:type="dxa" w:w="90"/>
-              <w:right w:type="dxa" w:w="110"/>
-            </w:tcMar>
-            <w:vAlign w:val="center"/>
-          </w:tcPr>
-          <w:p>
-            <w:pPr>
-              <w:keepLines/>
-              <w:spacing w:after="0" w:line="250"/>
-              <w:jc w:val="left"/>
-            </w:pPr>
-            <w:r>
-              <w:rPr>
-                <w:rFonts w:ascii="Calibri" w:cs="Calibri" w:eastAsia="Calibri" w:hAnsi="Calibri"/>
-                <w:b/>
-                <w:bCs/>
-                <w:color w:val="000000"/>
-                <w:sz w:val="19"/>
-                <w:szCs w:val="19"/>
-              </w:rPr>
-              <w:t xml:space="preserve">Evidence to retain</w:t>
-            </w:r>
-          </w:p>
-        </w:tc>
-        <w:tc>
-          <w:tcPr>
-            <w:tcW w:type="dxa" w:w="3214"/>
-            <w:tcBorders>
-              <w:top w:val="single" w:color="B7B7B7" w:sz="5"/>
-              <w:left w:val="single" w:color="B7B7B7" w:sz="5"/>
-              <w:bottom w:val="single" w:color="B7B7B7" w:sz="5"/>
-              <w:right w:val="single" w:color="B7B7B7" w:sz="5"/>
-            </w:tcBorders>
-            <w:shd w:fill="E6E6E6" w:val="clear"/>
-            <w:tcMar>
-              <w:top w:type="dxa" w:w="90"/>
-              <w:left w:type="dxa" w:w="110"/>
-              <w:bottom w:type="dxa" w:w="90"/>
-              <w:right w:type="dxa" w:w="110"/>
-            </w:tcMar>
-            <w:vAlign w:val="center"/>
-          </w:tcPr>
-          <w:p>
-            <w:pPr>
-              <w:keepLines/>
-              <w:spacing w:after="0" w:line="250"/>
-              <w:jc w:val="left"/>
-            </w:pPr>
-            <w:r>
-              <w:rPr>
-                <w:rFonts w:ascii="Calibri" w:cs="Calibri" w:eastAsia="Calibri" w:hAnsi="Calibri"/>
-                <w:b/>
-                <w:bCs/>
-                <w:color w:val="000000"/>
-                <w:sz w:val="19"/>
-                <w:szCs w:val="19"/>
-              </w:rPr>
-              <w:t xml:space="preserve">Status</w:t>
-            </w:r>
-          </w:p>
-        </w:tc>
-      </w:tr>
-      <w:tr>
-        <w:trPr>
-          <w:cantSplit/>
-          <w:tblHeader w:val="false"/>
-        </w:trPr>
-        <w:tc>
-          <w:tcPr>
-            <w:tcW w:type="dxa" w:w="3212"/>
-            <w:tcBorders>
-              <w:top w:val="single" w:color="B7B7B7" w:sz="5"/>
-              <w:left w:val="single" w:color="B7B7B7" w:sz="5"/>
-              <w:bottom w:val="single" w:color="B7B7B7" w:sz="5"/>
-              <w:right w:val="single" w:color="B7B7B7" w:sz="5"/>
-            </w:tcBorders>
-            <w:shd w:fill="FFFFFF" w:val="clear"/>
-            <w:tcMar>
-              <w:top w:type="dxa" w:w="90"/>
-              <w:left w:type="dxa" w:w="110"/>
-              <w:bottom w:type="dxa" w:w="90"/>
-              <w:right w:type="dxa" w:w="110"/>
-            </w:tcMar>
-            <w:vAlign w:val="center"/>
-          </w:tcPr>
-          <w:p>
-            <w:pPr>
-              <w:keepLines/>
-              <w:spacing w:after="0" w:line="250"/>
-              <w:jc w:val="left"/>
-            </w:pPr>
-            <w:r>
-              <w:rPr>
-                <w:rFonts w:ascii="Calibri" w:cs="Calibri" w:eastAsia="Calibri" w:hAnsi="Calibri"/>
-                <w:b w:val="false"/>
-                <w:bCs w:val="false"/>
-                <w:color w:val="000000"/>
-                <w:sz w:val="19"/>
-                <w:szCs w:val="19"/>
-              </w:rPr>
-              <w:t xml:space="preserve">Sign-in, role restrictions, and administrative access</w:t>
-            </w:r>
-          </w:p>
-        </w:tc>
-        <w:tc>
-          <w:tcPr>
-            <w:tcW w:type="dxa" w:w="3212"/>
-            <w:tcBorders>
-              <w:top w:val="single" w:color="B7B7B7" w:sz="5"/>
-              <w:left w:val="single" w:color="B7B7B7" w:sz="5"/>
-              <w:bottom w:val="single" w:color="B7B7B7" w:sz="5"/>
-              <w:right w:val="single" w:color="B7B7B7" w:sz="5"/>
-            </w:tcBorders>
-            <w:shd w:fill="FFFFFF" w:val="clear"/>
-            <w:tcMar>
-              <w:top w:type="dxa" w:w="90"/>
-              <w:left w:type="dxa" w:w="110"/>
-              <w:bottom w:type="dxa" w:w="90"/>
-              <w:right w:type="dxa" w:w="110"/>
-            </w:tcMar>
-            <w:vAlign w:val="center"/>
-          </w:tcPr>
-          <w:p>
-            <w:pPr>
-              <w:keepLines/>
-              <w:spacing w:after="0" w:line="250"/>
-              <w:jc w:val="left"/>
-            </w:pPr>
-            <w:r>
-              <w:rPr>
-                <w:rFonts w:ascii="Calibri" w:cs="Calibri" w:eastAsia="Calibri" w:hAnsi="Calibri"/>
-                <w:b w:val="false"/>
-                <w:bCs w:val="false"/>
-                <w:color w:val="000000"/>
-                <w:sz w:val="19"/>
-                <w:szCs w:val="19"/>
-              </w:rPr>
-              <w:t xml:space="preserve">Sanitized screenshots or test record for each relevant role</w:t>
-            </w:r>
-          </w:p>
-        </w:tc>
-        <w:tc>
-          <w:tcPr>
-            <w:tcW w:type="dxa" w:w="3214"/>
-            <w:tcBorders>
-              <w:top w:val="single" w:color="B7B7B7" w:sz="5"/>
-              <w:left w:val="single" w:color="B7B7B7" w:sz="5"/>
-              <w:bottom w:val="single" w:color="B7B7B7" w:sz="5"/>
-              <w:right w:val="single" w:color="B7B7B7" w:sz="5"/>
-            </w:tcBorders>
-            <w:shd w:fill="FFFFFF" w:val="clear"/>
-            <w:tcMar>
-              <w:top w:type="dxa" w:w="90"/>
-              <w:left w:type="dxa" w:w="110"/>
-              <w:bottom w:type="dxa" w:w="90"/>
-              <w:right w:type="dxa" w:w="110"/>
-            </w:tcMar>
-            <w:vAlign w:val="center"/>
-          </w:tcPr>
-          <w:p>
-            <w:pPr>
-              <w:keepLines/>
-              <w:spacing w:after="0" w:line="250"/>
-              <w:jc w:val="left"/>
-            </w:pPr>
-            <w:r>
-              <w:rPr>
-                <w:rFonts w:ascii="Calibri" w:cs="Calibri" w:eastAsia="Calibri" w:hAnsi="Calibri"/>
-                <w:b w:val="false"/>
-                <w:bCs w:val="false"/>
-                <w:color w:val="000000"/>
-                <w:sz w:val="19"/>
-                <w:szCs w:val="19"/>
-              </w:rPr>
-              <w:t xml:space="preserve">[Not recorded in this report]</w:t>
-            </w:r>
-          </w:p>
-        </w:tc>
-      </w:tr>
-      <w:tr>
-        <w:trPr>
-          <w:cantSplit/>
-          <w:tblHeader w:val="false"/>
-        </w:trPr>
-        <w:tc>
-          <w:tcPr>
-            <w:tcW w:type="dxa" w:w="3212"/>
-            <w:tcBorders>
-              <w:top w:val="single" w:color="B7B7B7" w:sz="5"/>
-              <w:left w:val="single" w:color="B7B7B7" w:sz="5"/>
-              <w:bottom w:val="single" w:color="B7B7B7" w:sz="5"/>
-              <w:right w:val="single" w:color="B7B7B7" w:sz="5"/>
-            </w:tcBorders>
-            <w:shd w:fill="F7F7F7" w:val="clear"/>
-            <w:tcMar>
-              <w:top w:type="dxa" w:w="90"/>
-              <w:left w:type="dxa" w:w="110"/>
-              <w:bottom w:type="dxa" w:w="90"/>
-              <w:right w:type="dxa" w:w="110"/>
-            </w:tcMar>
-            <w:vAlign w:val="center"/>
-          </w:tcPr>
-          <w:p>
-            <w:pPr>
-              <w:keepLines/>
-              <w:spacing w:after="0" w:line="250"/>
-              <w:jc w:val="left"/>
-            </w:pPr>
-            <w:r>
-              <w:rPr>
-                <w:rFonts w:ascii="Calibri" w:cs="Calibri" w:eastAsia="Calibri" w:hAnsi="Calibri"/>
-                <w:b w:val="false"/>
-                <w:bCs w:val="false"/>
-                <w:color w:val="000000"/>
-                <w:sz w:val="19"/>
-                <w:szCs w:val="19"/>
-              </w:rPr>
-              <w:t xml:space="preserve">Create/open/save a project</w:t>
-            </w:r>
-          </w:p>
-        </w:tc>
-        <w:tc>
-          <w:tcPr>
-            <w:tcW w:type="dxa" w:w="3212"/>
-            <w:tcBorders>
-              <w:top w:val="single" w:color="B7B7B7" w:sz="5"/>
-              <w:left w:val="single" w:color="B7B7B7" w:sz="5"/>
-              <w:bottom w:val="single" w:color="B7B7B7" w:sz="5"/>
-              <w:right w:val="single" w:color="B7B7B7" w:sz="5"/>
-            </w:tcBorders>
-            <w:shd w:fill="F7F7F7" w:val="clear"/>
-            <w:tcMar>
-              <w:top w:type="dxa" w:w="90"/>
-              <w:left w:type="dxa" w:w="110"/>
-              <w:bottom w:type="dxa" w:w="90"/>
-              <w:right w:type="dxa" w:w="110"/>
-            </w:tcMar>
-            <w:vAlign w:val="center"/>
-          </w:tcPr>
-          <w:p>
-            <w:pPr>
-              <w:keepLines/>
-              <w:spacing w:after="0" w:line="250"/>
-              <w:jc w:val="left"/>
-            </w:pPr>
-            <w:r>
-              <w:rPr>
-                <w:rFonts w:ascii="Calibri" w:cs="Calibri" w:eastAsia="Calibri" w:hAnsi="Calibri"/>
-                <w:b w:val="false"/>
-                <w:bCs w:val="false"/>
-                <w:color w:val="000000"/>
-                <w:sz w:val="19"/>
-                <w:szCs w:val="19"/>
-              </w:rPr>
-              <w:t xml:space="preserve">Test project and result record</w:t>
-            </w:r>
-          </w:p>
-        </w:tc>
-        <w:tc>
-          <w:tcPr>
-            <w:tcW w:type="dxa" w:w="3214"/>
-            <w:tcBorders>
-              <w:top w:val="single" w:color="B7B7B7" w:sz="5"/>
-              <w:left w:val="single" w:color="B7B7B7" w:sz="5"/>
-              <w:bottom w:val="single" w:color="B7B7B7" w:sz="5"/>
-              <w:right w:val="single" w:color="B7B7B7" w:sz="5"/>
-            </w:tcBorders>
-            <w:shd w:fill="F7F7F7" w:val="clear"/>
-            <w:tcMar>
-              <w:top w:type="dxa" w:w="90"/>
-              <w:left w:type="dxa" w:w="110"/>
-              <w:bottom w:type="dxa" w:w="90"/>
-              <w:right w:type="dxa" w:w="110"/>
-            </w:tcMar>
-            <w:vAlign w:val="center"/>
-          </w:tcPr>
-          <w:p>
-            <w:pPr>
-              <w:keepLines/>
-              <w:spacing w:after="0" w:line="250"/>
-              <w:jc w:val="left"/>
-            </w:pPr>
-            <w:r>
-              <w:rPr>
-                <w:rFonts w:ascii="Calibri" w:cs="Calibri" w:eastAsia="Calibri" w:hAnsi="Calibri"/>
-                <w:b w:val="false"/>
-                <w:bCs w:val="false"/>
-                <w:color w:val="000000"/>
-                <w:sz w:val="19"/>
-                <w:szCs w:val="19"/>
-              </w:rPr>
-              <w:t xml:space="preserve">[Not recorded in this report]</w:t>
-            </w:r>
-          </w:p>
-        </w:tc>
-      </w:tr>
-      <w:tr>
-        <w:trPr>
-          <w:cantSplit/>
-          <w:tblHeader w:val="false"/>
-        </w:trPr>
-        <w:tc>
-          <w:tcPr>
-            <w:tcW w:type="dxa" w:w="3212"/>
-            <w:tcBorders>
-              <w:top w:val="single" w:color="B7B7B7" w:sz="5"/>
-              <w:left w:val="single" w:color="B7B7B7" w:sz="5"/>
-              <w:bottom w:val="single" w:color="B7B7B7" w:sz="5"/>
-              <w:right w:val="single" w:color="B7B7B7" w:sz="5"/>
-            </w:tcBorders>
-            <w:shd w:fill="FFFFFF" w:val="clear"/>
-            <w:tcMar>
-              <w:top w:type="dxa" w:w="90"/>
-              <w:left w:type="dxa" w:w="110"/>
-              <w:bottom w:type="dxa" w:w="90"/>
-              <w:right w:type="dxa" w:w="110"/>
-            </w:tcMar>
-            <w:vAlign w:val="center"/>
-          </w:tcPr>
-          <w:p>
-            <w:pPr>
-              <w:keepLines/>
-              <w:spacing w:after="0" w:line="250"/>
-              <w:jc w:val="left"/>
-            </w:pPr>
-            <w:r>
-              <w:rPr>
-                <w:rFonts w:ascii="Calibri" w:cs="Calibri" w:eastAsia="Calibri" w:hAnsi="Calibri"/>
-                <w:b w:val="false"/>
-                <w:bCs w:val="false"/>
-                <w:color w:val="000000"/>
-                <w:sz w:val="19"/>
-                <w:szCs w:val="19"/>
-              </w:rPr>
-              <w:t xml:space="preserve">Generate and re-import .INP</w:t>
-            </w:r>
-          </w:p>
-        </w:tc>
-        <w:tc>
-          <w:tcPr>
-            <w:tcW w:type="dxa" w:w="3212"/>
-            <w:tcBorders>
-              <w:top w:val="single" w:color="B7B7B7" w:sz="5"/>
-              <w:left w:val="single" w:color="B7B7B7" w:sz="5"/>
-              <w:bottom w:val="single" w:color="B7B7B7" w:sz="5"/>
-              <w:right w:val="single" w:color="B7B7B7" w:sz="5"/>
-            </w:tcBorders>
-            <w:shd w:fill="FFFFFF" w:val="clear"/>
-            <w:tcMar>
-              <w:top w:type="dxa" w:w="90"/>
-              <w:left w:type="dxa" w:w="110"/>
-              <w:bottom w:type="dxa" w:w="90"/>
-              <w:right w:type="dxa" w:w="110"/>
-            </w:tcMar>
-            <w:vAlign w:val="center"/>
-          </w:tcPr>
-          <w:p>
-            <w:pPr>
-              <w:keepLines/>
-              <w:spacing w:after="0" w:line="250"/>
-              <w:jc w:val="left"/>
-            </w:pPr>
-            <w:r>
-              <w:rPr>
-                <w:rFonts w:ascii="Calibri" w:cs="Calibri" w:eastAsia="Calibri" w:hAnsi="Calibri"/>
-                <w:b w:val="false"/>
-                <w:bCs w:val="false"/>
-                <w:color w:val="000000"/>
-                <w:sz w:val="19"/>
-                <w:szCs w:val="19"/>
-              </w:rPr>
-              <w:t xml:space="preserve">Original and generated input files, plus comparison notes</w:t>
-            </w:r>
-          </w:p>
-        </w:tc>
-        <w:tc>
-          <w:tcPr>
-            <w:tcW w:type="dxa" w:w="3214"/>
-            <w:tcBorders>
-              <w:top w:val="single" w:color="B7B7B7" w:sz="5"/>
-              <w:left w:val="single" w:color="B7B7B7" w:sz="5"/>
-              <w:bottom w:val="single" w:color="B7B7B7" w:sz="5"/>
-              <w:right w:val="single" w:color="B7B7B7" w:sz="5"/>
-            </w:tcBorders>
-            <w:shd w:fill="FFFFFF" w:val="clear"/>
-            <w:tcMar>
-              <w:top w:type="dxa" w:w="90"/>
-              <w:left w:type="dxa" w:w="110"/>
-              <w:bottom w:type="dxa" w:w="90"/>
-              <w:right w:type="dxa" w:w="110"/>
-            </w:tcMar>
-            <w:vAlign w:val="center"/>
-          </w:tcPr>
-          <w:p>
-            <w:pPr>
-              <w:keepLines/>
-              <w:spacing w:after="0" w:line="250"/>
-              <w:jc w:val="left"/>
-            </w:pPr>
-            <w:r>
-              <w:rPr>
-                <w:rFonts w:ascii="Calibri" w:cs="Calibri" w:eastAsia="Calibri" w:hAnsi="Calibri"/>
-                <w:b w:val="false"/>
-                <w:bCs w:val="false"/>
-                <w:color w:val="000000"/>
-                <w:sz w:val="19"/>
-                <w:szCs w:val="19"/>
-              </w:rPr>
-              <w:t xml:space="preserve">[Not recorded in this report]</w:t>
-            </w:r>
-          </w:p>
-        </w:tc>
-      </w:tr>
-      <w:tr>
-        <w:trPr>
-          <w:cantSplit/>
-          <w:tblHeader w:val="false"/>
-        </w:trPr>
-        <w:tc>
-          <w:tcPr>
-            <w:tcW w:type="dxa" w:w="3212"/>
-            <w:tcBorders>
-              <w:top w:val="single" w:color="B7B7B7" w:sz="5"/>
-              <w:left w:val="single" w:color="B7B7B7" w:sz="5"/>
-              <w:bottom w:val="single" w:color="B7B7B7" w:sz="5"/>
-              <w:right w:val="single" w:color="B7B7B7" w:sz="5"/>
-            </w:tcBorders>
-            <w:shd w:fill="F7F7F7" w:val="clear"/>
-            <w:tcMar>
-              <w:top w:type="dxa" w:w="90"/>
-              <w:left w:type="dxa" w:w="110"/>
-              <w:bottom w:type="dxa" w:w="90"/>
-              <w:right w:type="dxa" w:w="110"/>
-            </w:tcMar>
-            <w:vAlign w:val="center"/>
-          </w:tcPr>
-          <w:p>
-            <w:pPr>
-              <w:keepLines/>
-              <w:spacing w:after="0" w:line="250"/>
-              <w:jc w:val="left"/>
-            </w:pPr>
-            <w:r>
-              <w:rPr>
-                <w:rFonts w:ascii="Calibri" w:cs="Calibri" w:eastAsia="Calibri" w:hAnsi="Calibri"/>
-                <w:b w:val="false"/>
-                <w:bCs w:val="false"/>
-                <w:color w:val="000000"/>
-                <w:sz w:val="19"/>
-                <w:szCs w:val="19"/>
-              </w:rPr>
-              <w:t xml:space="preserve">Manually add HISTORY requests</w:t>
-            </w:r>
-          </w:p>
-        </w:tc>
-        <w:tc>
-          <w:tcPr>
-            <w:tcW w:type="dxa" w:w="3212"/>
-            <w:tcBorders>
-              <w:top w:val="single" w:color="B7B7B7" w:sz="5"/>
-              <w:left w:val="single" w:color="B7B7B7" w:sz="5"/>
-              <w:bottom w:val="single" w:color="B7B7B7" w:sz="5"/>
-              <w:right w:val="single" w:color="B7B7B7" w:sz="5"/>
-            </w:tcBorders>
-            <w:shd w:fill="F7F7F7" w:val="clear"/>
-            <w:tcMar>
-              <w:top w:type="dxa" w:w="90"/>
-              <w:left w:type="dxa" w:w="110"/>
-              <w:bottom w:type="dxa" w:w="90"/>
-              <w:right w:type="dxa" w:w="110"/>
-            </w:tcMar>
-            <w:vAlign w:val="center"/>
-          </w:tcPr>
-          <w:p>
-            <w:pPr>
-              <w:keepLines/>
-              <w:spacing w:after="0" w:line="250"/>
-              <w:jc w:val="left"/>
-            </w:pPr>
-            <w:r>
-              <w:rPr>
-                <w:rFonts w:ascii="Calibri" w:cs="Calibri" w:eastAsia="Calibri" w:hAnsi="Calibri"/>
-                <w:b w:val="false"/>
-                <w:bCs w:val="false"/>
-                <w:color w:val="000000"/>
-                <w:sz w:val="19"/>
-                <w:szCs w:val="19"/>
-              </w:rPr>
-              <w:t xml:space="preserve">Screenshot or generated input excerpt showing selected requests</w:t>
-            </w:r>
-          </w:p>
-        </w:tc>
-        <w:tc>
-          <w:tcPr>
-            <w:tcW w:type="dxa" w:w="3214"/>
-            <w:tcBorders>
-              <w:top w:val="single" w:color="B7B7B7" w:sz="5"/>
-              <w:left w:val="single" w:color="B7B7B7" w:sz="5"/>
-              <w:bottom w:val="single" w:color="B7B7B7" w:sz="5"/>
-              <w:right w:val="single" w:color="B7B7B7" w:sz="5"/>
-            </w:tcBorders>
-            <w:shd w:fill="F7F7F7" w:val="clear"/>
-            <w:tcMar>
-              <w:top w:type="dxa" w:w="90"/>
-              <w:left w:type="dxa" w:w="110"/>
-              <w:bottom w:type="dxa" w:w="90"/>
-              <w:right w:type="dxa" w:w="110"/>
-            </w:tcMar>
-            <w:vAlign w:val="center"/>
-          </w:tcPr>
-          <w:p>
-            <w:pPr>
-              <w:keepLines/>
-              <w:spacing w:after="0" w:line="250"/>
-              <w:jc w:val="left"/>
-            </w:pPr>
-            <w:r>
-              <w:rPr>
-                <w:rFonts w:ascii="Calibri" w:cs="Calibri" w:eastAsia="Calibri" w:hAnsi="Calibri"/>
-                <w:b w:val="false"/>
-                <w:bCs w:val="false"/>
-                <w:color w:val="000000"/>
-                <w:sz w:val="19"/>
-                <w:szCs w:val="19"/>
-              </w:rPr>
-              <w:t xml:space="preserve">[Not recorded in this report]</w:t>
-            </w:r>
-          </w:p>
-        </w:tc>
-      </w:tr>
-      <w:tr>
-        <w:trPr>
-          <w:cantSplit/>
-          <w:tblHeader w:val="false"/>
-        </w:trPr>
-        <w:tc>
-          <w:tcPr>
-            <w:tcW w:type="dxa" w:w="3212"/>
-            <w:tcBorders>
-              <w:top w:val="single" w:color="B7B7B7" w:sz="5"/>
-              <w:left w:val="single" w:color="B7B7B7" w:sz="5"/>
-              <w:bottom w:val="single" w:color="B7B7B7" w:sz="5"/>
-              <w:right w:val="single" w:color="B7B7B7" w:sz="5"/>
-            </w:tcBorders>
-            <w:shd w:fill="FFFFFF" w:val="clear"/>
-            <w:tcMar>
-              <w:top w:type="dxa" w:w="90"/>
-              <w:left w:type="dxa" w:w="110"/>
-              <w:bottom w:type="dxa" w:w="90"/>
-              <w:right w:type="dxa" w:w="110"/>
-            </w:tcMar>
-            <w:vAlign w:val="center"/>
-          </w:tcPr>
-          <w:p>
-            <w:pPr>
-              <w:keepLines/>
-              <w:spacing w:after="0" w:line="250"/>
-              <w:jc w:val="left"/>
-            </w:pPr>
-            <w:r>
-              <w:rPr>
-                <w:rFonts w:ascii="Calibri" w:cs="Calibri" w:eastAsia="Calibri" w:hAnsi="Calibri"/>
-                <w:b w:val="false"/>
-                <w:bCs w:val="false"/>
-                <w:color w:val="000000"/>
-                <w:sz w:val="19"/>
-                <w:szCs w:val="19"/>
-              </w:rPr>
-              <w:t xml:space="preserve">Unit toggles and shape calculations</w:t>
-            </w:r>
-          </w:p>
-        </w:tc>
-        <w:tc>
-          <w:tcPr>
-            <w:tcW w:type="dxa" w:w="3212"/>
-            <w:tcBorders>
-              <w:top w:val="single" w:color="B7B7B7" w:sz="5"/>
-              <w:left w:val="single" w:color="B7B7B7" w:sz="5"/>
-              <w:bottom w:val="single" w:color="B7B7B7" w:sz="5"/>
-              <w:right w:val="single" w:color="B7B7B7" w:sz="5"/>
-            </w:tcBorders>
-            <w:shd w:fill="FFFFFF" w:val="clear"/>
-            <w:tcMar>
-              <w:top w:type="dxa" w:w="90"/>
-              <w:left w:type="dxa" w:w="110"/>
-              <w:bottom w:type="dxa" w:w="90"/>
-              <w:right w:type="dxa" w:w="110"/>
-            </w:tcMar>
-            <w:vAlign w:val="center"/>
-          </w:tcPr>
-          <w:p>
-            <w:pPr>
-              <w:keepLines/>
-              <w:spacing w:after="0" w:line="250"/>
-              <w:jc w:val="left"/>
-            </w:pPr>
-            <w:r>
-              <w:rPr>
-                <w:rFonts w:ascii="Calibri" w:cs="Calibri" w:eastAsia="Calibri" w:hAnsi="Calibri"/>
-                <w:b w:val="false"/>
-                <w:bCs w:val="false"/>
-                <w:color w:val="000000"/>
-                <w:sz w:val="19"/>
-                <w:szCs w:val="19"/>
-              </w:rPr>
-              <w:t xml:space="preserve">Input values, displayed calculations, and generated-file excerpt</w:t>
-            </w:r>
-          </w:p>
-        </w:tc>
-        <w:tc>
-          <w:tcPr>
-            <w:tcW w:type="dxa" w:w="3214"/>
-            <w:tcBorders>
-              <w:top w:val="single" w:color="B7B7B7" w:sz="5"/>
-              <w:left w:val="single" w:color="B7B7B7" w:sz="5"/>
-              <w:bottom w:val="single" w:color="B7B7B7" w:sz="5"/>
-              <w:right w:val="single" w:color="B7B7B7" w:sz="5"/>
-            </w:tcBorders>
-            <w:shd w:fill="FFFFFF" w:val="clear"/>
-            <w:tcMar>
-              <w:top w:type="dxa" w:w="90"/>
-              <w:left w:type="dxa" w:w="110"/>
-              <w:bottom w:type="dxa" w:w="90"/>
-              <w:right w:type="dxa" w:w="110"/>
-            </w:tcMar>
-            <w:vAlign w:val="center"/>
-          </w:tcPr>
-          <w:p>
-            <w:pPr>
-              <w:keepLines/>
-              <w:spacing w:after="0" w:line="250"/>
-              <w:jc w:val="left"/>
-            </w:pPr>
-            <w:r>
-              <w:rPr>
-                <w:rFonts w:ascii="Calibri" w:cs="Calibri" w:eastAsia="Calibri" w:hAnsi="Calibri"/>
-                <w:b w:val="false"/>
-                <w:bCs w:val="false"/>
-                <w:color w:val="000000"/>
-                <w:sz w:val="19"/>
-                <w:szCs w:val="19"/>
-              </w:rPr>
-              <w:t xml:space="preserve">[Not recorded in this report]</w:t>
-            </w:r>
-          </w:p>
-        </w:tc>
-      </w:tr>
-      <w:tr>
-        <w:trPr>
-          <w:cantSplit/>
-          <w:tblHeader w:val="false"/>
-        </w:trPr>
-        <w:tc>
-          <w:tcPr>
-            <w:tcW w:type="dxa" w:w="3212"/>
-            <w:tcBorders>
-              <w:top w:val="single" w:color="B7B7B7" w:sz="5"/>
-              <w:left w:val="single" w:color="B7B7B7" w:sz="5"/>
-              <w:bottom w:val="single" w:color="B7B7B7" w:sz="5"/>
-              <w:right w:val="single" w:color="B7B7B7" w:sz="5"/>
-            </w:tcBorders>
-            <w:shd w:fill="F7F7F7" w:val="clear"/>
-            <w:tcMar>
-              <w:top w:type="dxa" w:w="90"/>
-              <w:left w:type="dxa" w:w="110"/>
-              <w:bottom w:type="dxa" w:w="90"/>
-              <w:right w:type="dxa" w:w="110"/>
-            </w:tcMar>
-            <w:vAlign w:val="center"/>
-          </w:tcPr>
-          <w:p>
-            <w:pPr>
-              <w:keepLines/>
-              <w:spacing w:after="0" w:line="250"/>
-              <w:jc w:val="left"/>
-            </w:pPr>
-            <w:r>
-              <w:rPr>
-                <w:rFonts w:ascii="Calibri" w:cs="Calibri" w:eastAsia="Calibri" w:hAnsi="Calibri"/>
-                <w:b w:val="false"/>
-                <w:bCs w:val="false"/>
-                <w:color w:val="000000"/>
-                <w:sz w:val="19"/>
-                <w:szCs w:val="19"/>
-              </w:rPr>
-              <w:t xml:space="preserve">.OUT generation or local execution</w:t>
-            </w:r>
-          </w:p>
-        </w:tc>
-        <w:tc>
-          <w:tcPr>
-            <w:tcW w:type="dxa" w:w="3212"/>
-            <w:tcBorders>
-              <w:top w:val="single" w:color="B7B7B7" w:sz="5"/>
-              <w:left w:val="single" w:color="B7B7B7" w:sz="5"/>
-              <w:bottom w:val="single" w:color="B7B7B7" w:sz="5"/>
-              <w:right w:val="single" w:color="B7B7B7" w:sz="5"/>
-            </w:tcBorders>
-            <w:shd w:fill="F7F7F7" w:val="clear"/>
-            <w:tcMar>
-              <w:top w:type="dxa" w:w="90"/>
-              <w:left w:type="dxa" w:w="110"/>
-              <w:bottom w:type="dxa" w:w="90"/>
-              <w:right w:type="dxa" w:w="110"/>
-            </w:tcMar>
-            <w:vAlign w:val="center"/>
-          </w:tcPr>
-          <w:p>
-            <w:pPr>
-              <w:keepLines/>
-              <w:spacing w:after="0" w:line="250"/>
-              <w:jc w:val="left"/>
-            </w:pPr>
-            <w:r>
-              <w:rPr>
-                <w:rFonts w:ascii="Calibri" w:cs="Calibri" w:eastAsia="Calibri" w:hAnsi="Calibri"/>
-                <w:b w:val="false"/>
-                <w:bCs w:val="false"/>
-                <w:color w:val="000000"/>
-                <w:sz w:val="19"/>
-                <w:szCs w:val="19"/>
-              </w:rPr>
-              <w:t xml:space="preserve">Full WHAMO output and exact executable/version information</w:t>
-            </w:r>
-          </w:p>
-        </w:tc>
-        <w:tc>
-          <w:tcPr>
-            <w:tcW w:type="dxa" w:w="3214"/>
-            <w:tcBorders>
-              <w:top w:val="single" w:color="B7B7B7" w:sz="5"/>
-              <w:left w:val="single" w:color="B7B7B7" w:sz="5"/>
-              <w:bottom w:val="single" w:color="B7B7B7" w:sz="5"/>
-              <w:right w:val="single" w:color="B7B7B7" w:sz="5"/>
-            </w:tcBorders>
-            <w:shd w:fill="F7F7F7" w:val="clear"/>
-            <w:tcMar>
-              <w:top w:type="dxa" w:w="90"/>
-              <w:left w:type="dxa" w:w="110"/>
-              <w:bottom w:type="dxa" w:w="90"/>
-              <w:right w:type="dxa" w:w="110"/>
-            </w:tcMar>
-            <w:vAlign w:val="center"/>
-          </w:tcPr>
-          <w:p>
-            <w:pPr>
-              <w:keepLines/>
-              <w:spacing w:after="0" w:line="250"/>
-              <w:jc w:val="left"/>
-            </w:pPr>
-            <w:r>
-              <w:rPr>
-                <w:rFonts w:ascii="Calibri" w:cs="Calibri" w:eastAsia="Calibri" w:hAnsi="Calibri"/>
-                <w:b w:val="false"/>
-                <w:bCs w:val="false"/>
-                <w:color w:val="000000"/>
-                <w:sz w:val="19"/>
-                <w:szCs w:val="19"/>
-              </w:rPr>
-              <w:t xml:space="preserve">[Partially supplied; see Section 8.2]</w:t>
-            </w:r>
-          </w:p>
-        </w:tc>
-      </w:tr>
-      <w:tr>
-        <w:trPr>
-          <w:cantSplit/>
-          <w:tblHeader w:val="false"/>
-        </w:trPr>
-        <w:tc>
-          <w:tcPr>
-            <w:tcW w:type="dxa" w:w="3212"/>
-            <w:tcBorders>
-              <w:top w:val="single" w:color="B7B7B7" w:sz="5"/>
-              <w:left w:val="single" w:color="B7B7B7" w:sz="5"/>
-              <w:bottom w:val="single" w:color="B7B7B7" w:sz="5"/>
-              <w:right w:val="single" w:color="B7B7B7" w:sz="5"/>
-            </w:tcBorders>
-            <w:shd w:fill="FFFFFF" w:val="clear"/>
-            <w:tcMar>
-              <w:top w:type="dxa" w:w="90"/>
-              <w:left w:type="dxa" w:w="110"/>
-              <w:bottom w:type="dxa" w:w="90"/>
-              <w:right w:type="dxa" w:w="110"/>
-            </w:tcMar>
-            <w:vAlign w:val="center"/>
-          </w:tcPr>
-          <w:p>
-            <w:pPr>
-              <w:keepLines/>
-              <w:spacing w:after="0" w:line="250"/>
-              <w:jc w:val="left"/>
-            </w:pPr>
-            <w:r>
-              <w:rPr>
-                <w:rFonts w:ascii="Calibri" w:cs="Calibri" w:eastAsia="Calibri" w:hAnsi="Calibri"/>
-                <w:b w:val="false"/>
-                <w:bCs w:val="false"/>
-                <w:color w:val="000000"/>
-                <w:sz w:val="19"/>
-                <w:szCs w:val="19"/>
-              </w:rPr>
-              <w:t xml:space="preserve">Profile/history visualization</w:t>
-            </w:r>
-          </w:p>
-        </w:tc>
-        <w:tc>
-          <w:tcPr>
-            <w:tcW w:type="dxa" w:w="3212"/>
-            <w:tcBorders>
-              <w:top w:val="single" w:color="B7B7B7" w:sz="5"/>
-              <w:left w:val="single" w:color="B7B7B7" w:sz="5"/>
-              <w:bottom w:val="single" w:color="B7B7B7" w:sz="5"/>
-              <w:right w:val="single" w:color="B7B7B7" w:sz="5"/>
-            </w:tcBorders>
-            <w:shd w:fill="FFFFFF" w:val="clear"/>
-            <w:tcMar>
-              <w:top w:type="dxa" w:w="90"/>
-              <w:left w:type="dxa" w:w="110"/>
-              <w:bottom w:type="dxa" w:w="90"/>
-              <w:right w:type="dxa" w:w="110"/>
-            </w:tcMar>
-            <w:vAlign w:val="center"/>
-          </w:tcPr>
-          <w:p>
-            <w:pPr>
-              <w:keepLines/>
-              <w:spacing w:after="0" w:line="250"/>
-              <w:jc w:val="left"/>
-            </w:pPr>
-            <w:r>
-              <w:rPr>
-                <w:rFonts w:ascii="Calibri" w:cs="Calibri" w:eastAsia="Calibri" w:hAnsi="Calibri"/>
-                <w:b w:val="false"/>
-                <w:bCs w:val="false"/>
-                <w:color w:val="000000"/>
-                <w:sz w:val="19"/>
-                <w:szCs w:val="19"/>
-              </w:rPr>
-              <w:t xml:space="preserve">Sanitized screenshot and corresponding .OUT file</w:t>
-            </w:r>
-          </w:p>
-        </w:tc>
-        <w:tc>
-          <w:tcPr>
-            <w:tcW w:type="dxa" w:w="3214"/>
-            <w:tcBorders>
-              <w:top w:val="single" w:color="B7B7B7" w:sz="5"/>
-              <w:left w:val="single" w:color="B7B7B7" w:sz="5"/>
-              <w:bottom w:val="single" w:color="B7B7B7" w:sz="5"/>
-              <w:right w:val="single" w:color="B7B7B7" w:sz="5"/>
-            </w:tcBorders>
-            <w:shd w:fill="FFFFFF" w:val="clear"/>
-            <w:tcMar>
-              <w:top w:type="dxa" w:w="90"/>
-              <w:left w:type="dxa" w:w="110"/>
-              <w:bottom w:type="dxa" w:w="90"/>
-              <w:right w:type="dxa" w:w="110"/>
-            </w:tcMar>
-            <w:vAlign w:val="center"/>
-          </w:tcPr>
-          <w:p>
-            <w:pPr>
-              <w:keepLines/>
-              <w:spacing w:after="0" w:line="250"/>
-              <w:jc w:val="left"/>
-            </w:pPr>
-            <w:r>
-              <w:rPr>
-                <w:rFonts w:ascii="Calibri" w:cs="Calibri" w:eastAsia="Calibri" w:hAnsi="Calibri"/>
-                <w:b w:val="false"/>
-                <w:bCs w:val="false"/>
-                <w:color w:val="000000"/>
-                <w:sz w:val="19"/>
-                <w:szCs w:val="19"/>
-              </w:rPr>
-              <w:t xml:space="preserve">[Not recorded in this report]</w:t>
-            </w:r>
-          </w:p>
-        </w:tc>
-      </w:tr>
-      <w:tr>
-        <w:trPr>
-          <w:cantSplit/>
-          <w:tblHeader w:val="false"/>
-        </w:trPr>
-        <w:tc>
-          <w:tcPr>
-            <w:tcW w:type="dxa" w:w="3212"/>
-            <w:tcBorders>
-              <w:top w:val="single" w:color="B7B7B7" w:sz="5"/>
-              <w:left w:val="single" w:color="B7B7B7" w:sz="5"/>
-              <w:bottom w:val="single" w:color="B7B7B7" w:sz="5"/>
-              <w:right w:val="single" w:color="B7B7B7" w:sz="5"/>
-            </w:tcBorders>
-            <w:shd w:fill="F7F7F7" w:val="clear"/>
-            <w:tcMar>
-              <w:top w:type="dxa" w:w="90"/>
-              <w:left w:type="dxa" w:w="110"/>
-              <w:bottom w:type="dxa" w:w="90"/>
-              <w:right w:type="dxa" w:w="110"/>
-            </w:tcMar>
-            <w:vAlign w:val="center"/>
-          </w:tcPr>
-          <w:p>
-            <w:pPr>
-              <w:keepLines/>
-              <w:spacing w:after="0" w:line="250"/>
-              <w:jc w:val="left"/>
-            </w:pPr>
-            <w:r>
-              <w:rPr>
-                <w:rFonts w:ascii="Calibri" w:cs="Calibri" w:eastAsia="Calibri" w:hAnsi="Calibri"/>
-                <w:b w:val="false"/>
-                <w:bCs w:val="false"/>
-                <w:color w:val="000000"/>
-                <w:sz w:val="19"/>
-                <w:szCs w:val="19"/>
-              </w:rPr>
-              <w:t xml:space="preserve">Flex Table/Excel exchange</w:t>
-            </w:r>
-          </w:p>
-        </w:tc>
-        <w:tc>
-          <w:tcPr>
-            <w:tcW w:type="dxa" w:w="3212"/>
-            <w:tcBorders>
-              <w:top w:val="single" w:color="B7B7B7" w:sz="5"/>
-              <w:left w:val="single" w:color="B7B7B7" w:sz="5"/>
-              <w:bottom w:val="single" w:color="B7B7B7" w:sz="5"/>
-              <w:right w:val="single" w:color="B7B7B7" w:sz="5"/>
-            </w:tcBorders>
-            <w:shd w:fill="F7F7F7" w:val="clear"/>
-            <w:tcMar>
-              <w:top w:type="dxa" w:w="90"/>
-              <w:left w:type="dxa" w:w="110"/>
-              <w:bottom w:type="dxa" w:w="90"/>
-              <w:right w:type="dxa" w:w="110"/>
-            </w:tcMar>
-            <w:vAlign w:val="center"/>
-          </w:tcPr>
-          <w:p>
-            <w:pPr>
-              <w:keepLines/>
-              <w:spacing w:after="0" w:line="250"/>
-              <w:jc w:val="left"/>
-            </w:pPr>
-            <w:r>
-              <w:rPr>
-                <w:rFonts w:ascii="Calibri" w:cs="Calibri" w:eastAsia="Calibri" w:hAnsi="Calibri"/>
-                <w:b w:val="false"/>
-                <w:bCs w:val="false"/>
-                <w:color w:val="000000"/>
-                <w:sz w:val="19"/>
-                <w:szCs w:val="19"/>
-              </w:rPr>
-              <w:t xml:space="preserve">Sample workbook and round-trip result</w:t>
-            </w:r>
-          </w:p>
-        </w:tc>
-        <w:tc>
-          <w:tcPr>
-            <w:tcW w:type="dxa" w:w="3214"/>
-            <w:tcBorders>
-              <w:top w:val="single" w:color="B7B7B7" w:sz="5"/>
-              <w:left w:val="single" w:color="B7B7B7" w:sz="5"/>
-              <w:bottom w:val="single" w:color="B7B7B7" w:sz="5"/>
-              <w:right w:val="single" w:color="B7B7B7" w:sz="5"/>
-            </w:tcBorders>
-            <w:shd w:fill="F7F7F7" w:val="clear"/>
-            <w:tcMar>
-              <w:top w:type="dxa" w:w="90"/>
-              <w:left w:type="dxa" w:w="110"/>
-              <w:bottom w:type="dxa" w:w="90"/>
-              <w:right w:type="dxa" w:w="110"/>
-            </w:tcMar>
-            <w:vAlign w:val="center"/>
-          </w:tcPr>
-          <w:p>
-            <w:pPr>
-              <w:keepLines/>
-              <w:spacing w:after="0" w:line="250"/>
-              <w:jc w:val="left"/>
-            </w:pPr>
-            <w:r>
-              <w:rPr>
-                <w:rFonts w:ascii="Calibri" w:cs="Calibri" w:eastAsia="Calibri" w:hAnsi="Calibri"/>
-                <w:b w:val="false"/>
-                <w:bCs w:val="false"/>
-                <w:color w:val="000000"/>
-                <w:sz w:val="19"/>
-                <w:szCs w:val="19"/>
-              </w:rPr>
-              <w:t xml:space="preserve">[Not recorded in this report]</w:t>
-            </w:r>
-          </w:p>
-        </w:tc>
-      </w:tr>
-    </w:tbl>
-    <w:p>
-      <w:pPr>
-        <w:spacing w:after="100"/>
-      </w:pPr>
-    </w:p>
-    <w:p>
-      <w:pPr>
-        <w:pStyle w:val="Heading3"/>
-        <w:keepNext/>
-        <w:keepLines/>
-        <w:spacing w:after="120" w:before="210"/>
-      </w:pPr>
-      <w:r>
-        <w:t xml:space="preserve">8.4 Reproducibility record</w:t>
-      </w:r>
-    </w:p>
-    <w:p>
-      <w:pPr>
-        <w:keepLines/>
-        <w:widowControl/>
-        <w:spacing w:after="150" w:line="300"/>
-      </w:pPr>
-      <w:r>
-        <w:rPr>
-          <w:rFonts w:ascii="Calibri" w:cs="Calibri" w:eastAsia="Calibri" w:hAnsi="Calibri"/>
-          <w:color w:val="000000"/>
-          <w:sz w:val="22"/>
-          <w:szCs w:val="22"/>
-        </w:rPr>
-        <w:t xml:space="preserve">Complete this record from the final test environment:</w:t>
-      </w:r>
-    </w:p>
-    <w:tbl>
-      <w:tblPr>
-        <w:tblW w:type="dxa" w:w="9638"/>
-        <w:tblBorders>
-          <w:top w:val="single" w:color="B7B7B7" w:sz="5"/>
-          <w:left w:val="single" w:color="B7B7B7" w:sz="5"/>
-          <w:bottom w:val="single" w:color="B7B7B7" w:sz="5"/>
-          <w:right w:val="single" w:color="B7B7B7" w:sz="5"/>
-          <w:insideH w:val="single" w:color="B7B7B7" w:sz="5"/>
-          <w:insideV w:val="single" w:color="B7B7B7" w:sz="5"/>
-        </w:tblBorders>
-        <w:tblCellMar>
-          <w:top w:type="dxa" w:w="90"/>
-          <w:left w:type="dxa" w:w="110"/>
-          <w:bottom w:type="dxa" w:w="90"/>
-          <w:right w:type="dxa" w:w="110"/>
-        </w:tblCellMar>
-      </w:tblPr>
-      <w:tblGrid>
-        <w:gridCol w:w="4819"/>
-        <w:gridCol w:w="4819"/>
-      </w:tblGrid>
-      <w:tr>
-        <w:trPr>
-          <w:cantSplit/>
-          <w:tblHeader/>
-        </w:trPr>
-        <w:tc>
-          <w:tcPr>
-            <w:tcW w:type="dxa" w:w="4819"/>
-            <w:tcBorders>
-              <w:top w:val="single" w:color="B7B7B7" w:sz="5"/>
-              <w:left w:val="single" w:color="B7B7B7" w:sz="5"/>
-              <w:bottom w:val="single" w:color="B7B7B7" w:sz="5"/>
-              <w:right w:val="single" w:color="B7B7B7" w:sz="5"/>
-            </w:tcBorders>
-            <w:shd w:fill="E6E6E6" w:val="clear"/>
-            <w:tcMar>
-              <w:top w:type="dxa" w:w="90"/>
-              <w:left w:type="dxa" w:w="110"/>
-              <w:bottom w:type="dxa" w:w="90"/>
-              <w:right w:type="dxa" w:w="110"/>
-            </w:tcMar>
-            <w:vAlign w:val="center"/>
-          </w:tcPr>
-          <w:p>
-            <w:pPr>
-              <w:keepLines/>
-              <w:spacing w:after="0" w:line="250"/>
-              <w:jc w:val="left"/>
-            </w:pPr>
-            <w:r>
-              <w:rPr>
-                <w:rFonts w:ascii="Calibri" w:cs="Calibri" w:eastAsia="Calibri" w:hAnsi="Calibri"/>
-                <w:b/>
-                <w:bCs/>
-                <w:color w:val="000000"/>
-                <w:sz w:val="19"/>
-                <w:szCs w:val="19"/>
-              </w:rPr>
-              <w:t xml:space="preserve">Item</w:t>
-            </w:r>
-          </w:p>
-        </w:tc>
-        <w:tc>
-          <w:tcPr>
-            <w:tcW w:type="dxa" w:w="4819"/>
-            <w:tcBorders>
-              <w:top w:val="single" w:color="B7B7B7" w:sz="5"/>
-              <w:left w:val="single" w:color="B7B7B7" w:sz="5"/>
-              <w:bottom w:val="single" w:color="B7B7B7" w:sz="5"/>
-              <w:right w:val="single" w:color="B7B7B7" w:sz="5"/>
-            </w:tcBorders>
-            <w:shd w:fill="E6E6E6" w:val="clear"/>
-            <w:tcMar>
-              <w:top w:type="dxa" w:w="90"/>
-              <w:left w:type="dxa" w:w="110"/>
-              <w:bottom w:type="dxa" w:w="90"/>
-              <w:right w:type="dxa" w:w="110"/>
-            </w:tcMar>
-            <w:vAlign w:val="center"/>
-          </w:tcPr>
-          <w:p>
-            <w:pPr>
-              <w:keepLines/>
-              <w:spacing w:after="0" w:line="250"/>
-              <w:jc w:val="left"/>
-            </w:pPr>
-            <w:r>
-              <w:rPr>
-                <w:rFonts w:ascii="Calibri" w:cs="Calibri" w:eastAsia="Calibri" w:hAnsi="Calibri"/>
-                <w:b/>
-                <w:bCs/>
-                <w:color w:val="000000"/>
-                <w:sz w:val="19"/>
-                <w:szCs w:val="19"/>
-              </w:rPr>
-              <w:t xml:space="preserve">Record</w:t>
-            </w:r>
-          </w:p>
-        </w:tc>
-      </w:tr>
-      <w:tr>
-        <w:trPr>
-          <w:cantSplit/>
-          <w:tblHeader w:val="false"/>
-        </w:trPr>
-        <w:tc>
-          <w:tcPr>
-            <w:tcW w:type="dxa" w:w="4819"/>
-            <w:tcBorders>
-              <w:top w:val="single" w:color="B7B7B7" w:sz="5"/>
-              <w:left w:val="single" w:color="B7B7B7" w:sz="5"/>
-              <w:bottom w:val="single" w:color="B7B7B7" w:sz="5"/>
-              <w:right w:val="single" w:color="B7B7B7" w:sz="5"/>
-            </w:tcBorders>
-            <w:shd w:fill="FFFFFF" w:val="clear"/>
-            <w:tcMar>
-              <w:top w:type="dxa" w:w="90"/>
-              <w:left w:type="dxa" w:w="110"/>
-              <w:bottom w:type="dxa" w:w="90"/>
-              <w:right w:type="dxa" w:w="110"/>
-            </w:tcMar>
-            <w:vAlign w:val="center"/>
-          </w:tcPr>
-          <w:p>
-            <w:pPr>
-              <w:keepLines/>
-              <w:spacing w:after="0" w:line="250"/>
-              <w:jc w:val="left"/>
-            </w:pPr>
-            <w:r>
-              <w:rPr>
-                <w:rFonts w:ascii="Calibri" w:cs="Calibri" w:eastAsia="Calibri" w:hAnsi="Calibri"/>
-                <w:b w:val="false"/>
-                <w:bCs w:val="false"/>
-                <w:color w:val="000000"/>
-                <w:sz w:val="19"/>
-                <w:szCs w:val="19"/>
-              </w:rPr>
-              <w:t xml:space="preserve">Application release / source revision</w:t>
-            </w:r>
-          </w:p>
-        </w:tc>
-        <w:tc>
-          <w:tcPr>
-            <w:tcW w:type="dxa" w:w="4819"/>
-            <w:tcBorders>
-              <w:top w:val="single" w:color="B7B7B7" w:sz="5"/>
-              <w:left w:val="single" w:color="B7B7B7" w:sz="5"/>
-              <w:bottom w:val="single" w:color="B7B7B7" w:sz="5"/>
-              <w:right w:val="single" w:color="B7B7B7" w:sz="5"/>
-            </w:tcBorders>
-            <w:shd w:fill="FFFFFF" w:val="clear"/>
-            <w:tcMar>
-              <w:top w:type="dxa" w:w="90"/>
-              <w:left w:type="dxa" w:w="110"/>
-              <w:bottom w:type="dxa" w:w="90"/>
-              <w:right w:type="dxa" w:w="110"/>
-            </w:tcMar>
-            <w:vAlign w:val="center"/>
-          </w:tcPr>
-          <w:p>
-            <w:pPr>
-              <w:keepLines/>
-              <w:spacing w:after="0" w:line="250"/>
-              <w:jc w:val="left"/>
-            </w:pPr>
-            <w:r>
-              <w:rPr>
-                <w:rFonts w:ascii="Calibri" w:cs="Calibri" w:eastAsia="Calibri" w:hAnsi="Calibri"/>
-                <w:b w:val="false"/>
-                <w:bCs w:val="false"/>
-                <w:color w:val="000000"/>
-                <w:sz w:val="19"/>
-                <w:szCs w:val="19"/>
-              </w:rPr>
-              <w:t xml:space="preserve">[Tag, commit, or archive checksum]</w:t>
-            </w:r>
-          </w:p>
-        </w:tc>
-      </w:tr>
-      <w:tr>
-        <w:trPr>
-          <w:cantSplit/>
-          <w:tblHeader w:val="false"/>
-        </w:trPr>
-        <w:tc>
-          <w:tcPr>
-            <w:tcW w:type="dxa" w:w="4819"/>
-            <w:tcBorders>
-              <w:top w:val="single" w:color="B7B7B7" w:sz="5"/>
-              <w:left w:val="single" w:color="B7B7B7" w:sz="5"/>
-              <w:bottom w:val="single" w:color="B7B7B7" w:sz="5"/>
-              <w:right w:val="single" w:color="B7B7B7" w:sz="5"/>
-            </w:tcBorders>
-            <w:shd w:fill="F7F7F7" w:val="clear"/>
-            <w:tcMar>
-              <w:top w:type="dxa" w:w="90"/>
-              <w:left w:type="dxa" w:w="110"/>
-              <w:bottom w:type="dxa" w:w="90"/>
-              <w:right w:type="dxa" w:w="110"/>
-            </w:tcMar>
-            <w:vAlign w:val="center"/>
-          </w:tcPr>
-          <w:p>
-            <w:pPr>
-              <w:keepLines/>
-              <w:spacing w:after="0" w:line="250"/>
-              <w:jc w:val="left"/>
-            </w:pPr>
-            <w:r>
-              <w:rPr>
-                <w:rFonts w:ascii="Calibri" w:cs="Calibri" w:eastAsia="Calibri" w:hAnsi="Calibri"/>
-                <w:b w:val="false"/>
-                <w:bCs w:val="false"/>
-                <w:color w:val="000000"/>
-                <w:sz w:val="19"/>
-                <w:szCs w:val="19"/>
-              </w:rPr>
-              <w:t xml:space="preserve">Test date and tester</w:t>
-            </w:r>
-          </w:p>
-        </w:tc>
-        <w:tc>
-          <w:tcPr>
-            <w:tcW w:type="dxa" w:w="4819"/>
-            <w:tcBorders>
-              <w:top w:val="single" w:color="B7B7B7" w:sz="5"/>
-              <w:left w:val="single" w:color="B7B7B7" w:sz="5"/>
-              <w:bottom w:val="single" w:color="B7B7B7" w:sz="5"/>
-              <w:right w:val="single" w:color="B7B7B7" w:sz="5"/>
-            </w:tcBorders>
-            <w:shd w:fill="F7F7F7" w:val="clear"/>
-            <w:tcMar>
-              <w:top w:type="dxa" w:w="90"/>
-              <w:left w:type="dxa" w:w="110"/>
-              <w:bottom w:type="dxa" w:w="90"/>
-              <w:right w:type="dxa" w:w="110"/>
-            </w:tcMar>
-            <w:vAlign w:val="center"/>
-          </w:tcPr>
-          <w:p>
-            <w:pPr>
-              <w:keepLines/>
-              <w:spacing w:after="0" w:line="250"/>
-              <w:jc w:val="left"/>
-            </w:pPr>
-            <w:r>
-              <w:rPr>
-                <w:rFonts w:ascii="Calibri" w:cs="Calibri" w:eastAsia="Calibri" w:hAnsi="Calibri"/>
-                <w:b w:val="false"/>
-                <w:bCs w:val="false"/>
-                <w:color w:val="000000"/>
-                <w:sz w:val="19"/>
-                <w:szCs w:val="19"/>
-              </w:rPr>
-              <w:t xml:space="preserve">[Date and name]</w:t>
-            </w:r>
-          </w:p>
-        </w:tc>
-      </w:tr>
-      <w:tr>
-        <w:trPr>
-          <w:cantSplit/>
-          <w:tblHeader w:val="false"/>
-        </w:trPr>
-        <w:tc>
-          <w:tcPr>
-            <w:tcW w:type="dxa" w:w="4819"/>
-            <w:tcBorders>
-              <w:top w:val="single" w:color="B7B7B7" w:sz="5"/>
-              <w:left w:val="single" w:color="B7B7B7" w:sz="5"/>
-              <w:bottom w:val="single" w:color="B7B7B7" w:sz="5"/>
-              <w:right w:val="single" w:color="B7B7B7" w:sz="5"/>
-            </w:tcBorders>
-            <w:shd w:fill="FFFFFF" w:val="clear"/>
-            <w:tcMar>
-              <w:top w:type="dxa" w:w="90"/>
-              <w:left w:type="dxa" w:w="110"/>
-              <w:bottom w:type="dxa" w:w="90"/>
-              <w:right w:type="dxa" w:w="110"/>
-            </w:tcMar>
-            <w:vAlign w:val="center"/>
-          </w:tcPr>
-          <w:p>
-            <w:pPr>
-              <w:keepLines/>
-              <w:spacing w:after="0" w:line="250"/>
-              <w:jc w:val="left"/>
-            </w:pPr>
-            <w:r>
-              <w:rPr>
-                <w:rFonts w:ascii="Calibri" w:cs="Calibri" w:eastAsia="Calibri" w:hAnsi="Calibri"/>
-                <w:b w:val="false"/>
-                <w:bCs w:val="false"/>
-                <w:color w:val="000000"/>
-                <w:sz w:val="19"/>
-                <w:szCs w:val="19"/>
-              </w:rPr>
-              <w:t xml:space="preserve">Browser and operating system</w:t>
-            </w:r>
-          </w:p>
-        </w:tc>
-        <w:tc>
-          <w:tcPr>
-            <w:tcW w:type="dxa" w:w="4819"/>
-            <w:tcBorders>
-              <w:top w:val="single" w:color="B7B7B7" w:sz="5"/>
-              <w:left w:val="single" w:color="B7B7B7" w:sz="5"/>
-              <w:bottom w:val="single" w:color="B7B7B7" w:sz="5"/>
-              <w:right w:val="single" w:color="B7B7B7" w:sz="5"/>
-            </w:tcBorders>
-            <w:shd w:fill="FFFFFF" w:val="clear"/>
-            <w:tcMar>
-              <w:top w:type="dxa" w:w="90"/>
-              <w:left w:type="dxa" w:w="110"/>
-              <w:bottom w:type="dxa" w:w="90"/>
-              <w:right w:type="dxa" w:w="110"/>
-            </w:tcMar>
-            <w:vAlign w:val="center"/>
-          </w:tcPr>
-          <w:p>
-            <w:pPr>
-              <w:keepLines/>
-              <w:spacing w:after="0" w:line="250"/>
-              <w:jc w:val="left"/>
-            </w:pPr>
-            <w:r>
-              <w:rPr>
-                <w:rFonts w:ascii="Calibri" w:cs="Calibri" w:eastAsia="Calibri" w:hAnsi="Calibri"/>
-                <w:b w:val="false"/>
-                <w:bCs w:val="false"/>
-                <w:color w:val="000000"/>
-                <w:sz w:val="19"/>
-                <w:szCs w:val="19"/>
-              </w:rPr>
-              <w:t xml:space="preserve">[Details]</w:t>
-            </w:r>
-          </w:p>
-        </w:tc>
-      </w:tr>
-      <w:tr>
-        <w:trPr>
-          <w:cantSplit/>
-          <w:tblHeader w:val="false"/>
-        </w:trPr>
-        <w:tc>
-          <w:tcPr>
-            <w:tcW w:type="dxa" w:w="4819"/>
-            <w:tcBorders>
-              <w:top w:val="single" w:color="B7B7B7" w:sz="5"/>
-              <w:left w:val="single" w:color="B7B7B7" w:sz="5"/>
-              <w:bottom w:val="single" w:color="B7B7B7" w:sz="5"/>
-              <w:right w:val="single" w:color="B7B7B7" w:sz="5"/>
-            </w:tcBorders>
-            <w:shd w:fill="F7F7F7" w:val="clear"/>
-            <w:tcMar>
-              <w:top w:type="dxa" w:w="90"/>
-              <w:left w:type="dxa" w:w="110"/>
-              <w:bottom w:type="dxa" w:w="90"/>
-              <w:right w:type="dxa" w:w="110"/>
-            </w:tcMar>
-            <w:vAlign w:val="center"/>
-          </w:tcPr>
-          <w:p>
-            <w:pPr>
-              <w:keepLines/>
-              <w:spacing w:after="0" w:line="250"/>
-              <w:jc w:val="left"/>
-            </w:pPr>
-            <w:r>
-              <w:rPr>
-                <w:rFonts w:ascii="Calibri" w:cs="Calibri" w:eastAsia="Calibri" w:hAnsi="Calibri"/>
-                <w:b w:val="false"/>
-                <w:bCs w:val="false"/>
-                <w:color w:val="000000"/>
-                <w:sz w:val="19"/>
-                <w:szCs w:val="19"/>
-              </w:rPr>
-              <w:t xml:space="preserve">WHAMO executable version and location</w:t>
-            </w:r>
-          </w:p>
-        </w:tc>
-        <w:tc>
-          <w:tcPr>
-            <w:tcW w:type="dxa" w:w="4819"/>
-            <w:tcBorders>
-              <w:top w:val="single" w:color="B7B7B7" w:sz="5"/>
-              <w:left w:val="single" w:color="B7B7B7" w:sz="5"/>
-              <w:bottom w:val="single" w:color="B7B7B7" w:sz="5"/>
-              <w:right w:val="single" w:color="B7B7B7" w:sz="5"/>
-            </w:tcBorders>
-            <w:shd w:fill="F7F7F7" w:val="clear"/>
-            <w:tcMar>
-              <w:top w:type="dxa" w:w="90"/>
-              <w:left w:type="dxa" w:w="110"/>
-              <w:bottom w:type="dxa" w:w="90"/>
-              <w:right w:type="dxa" w:w="110"/>
-            </w:tcMar>
-            <w:vAlign w:val="center"/>
-          </w:tcPr>
-          <w:p>
-            <w:pPr>
-              <w:keepLines/>
-              <w:spacing w:after="0" w:line="250"/>
-              <w:jc w:val="left"/>
-            </w:pPr>
-            <w:r>
-              <w:rPr>
-                <w:rFonts w:ascii="Calibri" w:cs="Calibri" w:eastAsia="Calibri" w:hAnsi="Calibri"/>
-                <w:b w:val="false"/>
-                <w:bCs w:val="false"/>
-                <w:color w:val="000000"/>
-                <w:sz w:val="19"/>
-                <w:szCs w:val="19"/>
-              </w:rPr>
-              <w:t xml:space="preserve">[Exact version and approved environment]</w:t>
-            </w:r>
-          </w:p>
-        </w:tc>
-      </w:tr>
-      <w:tr>
-        <w:trPr>
-          <w:cantSplit/>
-          <w:tblHeader w:val="false"/>
-        </w:trPr>
-        <w:tc>
-          <w:tcPr>
-            <w:tcW w:type="dxa" w:w="4819"/>
-            <w:tcBorders>
-              <w:top w:val="single" w:color="B7B7B7" w:sz="5"/>
-              <w:left w:val="single" w:color="B7B7B7" w:sz="5"/>
-              <w:bottom w:val="single" w:color="B7B7B7" w:sz="5"/>
-              <w:right w:val="single" w:color="B7B7B7" w:sz="5"/>
-            </w:tcBorders>
-            <w:shd w:fill="FFFFFF" w:val="clear"/>
-            <w:tcMar>
-              <w:top w:type="dxa" w:w="90"/>
-              <w:left w:type="dxa" w:w="110"/>
-              <w:bottom w:type="dxa" w:w="90"/>
-              <w:right w:type="dxa" w:w="110"/>
-            </w:tcMar>
-            <w:vAlign w:val="center"/>
-          </w:tcPr>
-          <w:p>
-            <w:pPr>
-              <w:keepLines/>
-              <w:spacing w:after="0" w:line="250"/>
-              <w:jc w:val="left"/>
-            </w:pPr>
-            <w:r>
-              <w:rPr>
-                <w:rFonts w:ascii="Calibri" w:cs="Calibri" w:eastAsia="Calibri" w:hAnsi="Calibri"/>
-                <w:b w:val="false"/>
-                <w:bCs w:val="false"/>
-                <w:color w:val="000000"/>
-                <w:sz w:val="19"/>
-                <w:szCs w:val="19"/>
-              </w:rPr>
-              <w:t xml:space="preserve">Application server execution tested</w:t>
-            </w:r>
-          </w:p>
-        </w:tc>
-        <w:tc>
-          <w:tcPr>
-            <w:tcW w:type="dxa" w:w="4819"/>
-            <w:tcBorders>
-              <w:top w:val="single" w:color="B7B7B7" w:sz="5"/>
-              <w:left w:val="single" w:color="B7B7B7" w:sz="5"/>
-              <w:bottom w:val="single" w:color="B7B7B7" w:sz="5"/>
-              <w:right w:val="single" w:color="B7B7B7" w:sz="5"/>
-            </w:tcBorders>
-            <w:shd w:fill="FFFFFF" w:val="clear"/>
-            <w:tcMar>
-              <w:top w:type="dxa" w:w="90"/>
-              <w:left w:type="dxa" w:w="110"/>
-              <w:bottom w:type="dxa" w:w="90"/>
-              <w:right w:type="dxa" w:w="110"/>
-            </w:tcMar>
-            <w:vAlign w:val="center"/>
-          </w:tcPr>
-          <w:p>
-            <w:pPr>
-              <w:keepLines/>
-              <w:spacing w:after="0" w:line="250"/>
-              <w:jc w:val="left"/>
-            </w:pPr>
-            <w:r>
-              <w:rPr>
-                <w:rFonts w:ascii="Calibri" w:cs="Calibri" w:eastAsia="Calibri" w:hAnsi="Calibri"/>
-                <w:b w:val="false"/>
-                <w:bCs w:val="false"/>
-                <w:color w:val="000000"/>
-                <w:sz w:val="19"/>
-                <w:szCs w:val="19"/>
-              </w:rPr>
-              <w:t xml:space="preserve">[Yes / No; record result]</w:t>
-            </w:r>
-          </w:p>
-        </w:tc>
-      </w:tr>
-      <w:tr>
-        <w:trPr>
-          <w:cantSplit/>
-          <w:tblHeader w:val="false"/>
-        </w:trPr>
-        <w:tc>
-          <w:tcPr>
-            <w:tcW w:type="dxa" w:w="4819"/>
-            <w:tcBorders>
-              <w:top w:val="single" w:color="B7B7B7" w:sz="5"/>
-              <w:left w:val="single" w:color="B7B7B7" w:sz="5"/>
-              <w:bottom w:val="single" w:color="B7B7B7" w:sz="5"/>
-              <w:right w:val="single" w:color="B7B7B7" w:sz="5"/>
-            </w:tcBorders>
-            <w:shd w:fill="F7F7F7" w:val="clear"/>
-            <w:tcMar>
-              <w:top w:type="dxa" w:w="90"/>
-              <w:left w:type="dxa" w:w="110"/>
-              <w:bottom w:type="dxa" w:w="90"/>
-              <w:right w:type="dxa" w:w="110"/>
-            </w:tcMar>
-            <w:vAlign w:val="center"/>
-          </w:tcPr>
-          <w:p>
-            <w:pPr>
-              <w:keepLines/>
-              <w:spacing w:after="0" w:line="250"/>
-              <w:jc w:val="left"/>
-            </w:pPr>
-            <w:r>
-              <w:rPr>
-                <w:rFonts w:ascii="Calibri" w:cs="Calibri" w:eastAsia="Calibri" w:hAnsi="Calibri"/>
-                <w:b w:val="false"/>
-                <w:bCs w:val="false"/>
-                <w:color w:val="000000"/>
-                <w:sz w:val="19"/>
-                <w:szCs w:val="19"/>
-              </w:rPr>
-              <w:t xml:space="preserve">Test network/input file</w:t>
-            </w:r>
-          </w:p>
-        </w:tc>
-        <w:tc>
-          <w:tcPr>
-            <w:tcW w:type="dxa" w:w="4819"/>
-            <w:tcBorders>
-              <w:top w:val="single" w:color="B7B7B7" w:sz="5"/>
-              <w:left w:val="single" w:color="B7B7B7" w:sz="5"/>
-              <w:bottom w:val="single" w:color="B7B7B7" w:sz="5"/>
-              <w:right w:val="single" w:color="B7B7B7" w:sz="5"/>
-            </w:tcBorders>
-            <w:shd w:fill="F7F7F7" w:val="clear"/>
-            <w:tcMar>
-              <w:top w:type="dxa" w:w="90"/>
-              <w:left w:type="dxa" w:w="110"/>
-              <w:bottom w:type="dxa" w:w="90"/>
-              <w:right w:type="dxa" w:w="110"/>
-            </w:tcMar>
-            <w:vAlign w:val="center"/>
-          </w:tcPr>
-          <w:p>
-            <w:pPr>
-              <w:keepLines/>
-              <w:spacing w:after="0" w:line="250"/>
-              <w:jc w:val="left"/>
-            </w:pPr>
-            <w:r>
-              <w:rPr>
-                <w:rFonts w:ascii="Calibri" w:cs="Calibri" w:eastAsia="Calibri" w:hAnsi="Calibri"/>
-                <w:b w:val="false"/>
-                <w:bCs w:val="false"/>
-                <w:color w:val="000000"/>
-                <w:sz w:val="19"/>
-                <w:szCs w:val="19"/>
-              </w:rPr>
-              <w:t xml:space="preserve">[Approved evidence reference]</w:t>
-            </w:r>
-          </w:p>
-        </w:tc>
-      </w:tr>
-      <w:tr>
-        <w:trPr>
-          <w:cantSplit/>
-          <w:tblHeader w:val="false"/>
-        </w:trPr>
-        <w:tc>
-          <w:tcPr>
-            <w:tcW w:type="dxa" w:w="4819"/>
-            <w:tcBorders>
-              <w:top w:val="single" w:color="B7B7B7" w:sz="5"/>
-              <w:left w:val="single" w:color="B7B7B7" w:sz="5"/>
-              <w:bottom w:val="single" w:color="B7B7B7" w:sz="5"/>
-              <w:right w:val="single" w:color="B7B7B7" w:sz="5"/>
-            </w:tcBorders>
-            <w:shd w:fill="FFFFFF" w:val="clear"/>
-            <w:tcMar>
-              <w:top w:type="dxa" w:w="90"/>
-              <w:left w:type="dxa" w:w="110"/>
-              <w:bottom w:type="dxa" w:w="90"/>
-              <w:right w:type="dxa" w:w="110"/>
-            </w:tcMar>
-            <w:vAlign w:val="center"/>
-          </w:tcPr>
-          <w:p>
-            <w:pPr>
-              <w:keepLines/>
-              <w:spacing w:after="0" w:line="250"/>
-              <w:jc w:val="left"/>
-            </w:pPr>
-            <w:r>
-              <w:rPr>
-                <w:rFonts w:ascii="Calibri" w:cs="Calibri" w:eastAsia="Calibri" w:hAnsi="Calibri"/>
-                <w:b w:val="false"/>
-                <w:bCs w:val="false"/>
-                <w:color w:val="000000"/>
-                <w:sz w:val="19"/>
-                <w:szCs w:val="19"/>
-              </w:rPr>
-              <w:t xml:space="preserve">Output files and diagnostics</w:t>
-            </w:r>
-          </w:p>
-        </w:tc>
-        <w:tc>
-          <w:tcPr>
-            <w:tcW w:type="dxa" w:w="4819"/>
-            <w:tcBorders>
-              <w:top w:val="single" w:color="B7B7B7" w:sz="5"/>
-              <w:left w:val="single" w:color="B7B7B7" w:sz="5"/>
-              <w:bottom w:val="single" w:color="B7B7B7" w:sz="5"/>
-              <w:right w:val="single" w:color="B7B7B7" w:sz="5"/>
-            </w:tcBorders>
-            <w:shd w:fill="FFFFFF" w:val="clear"/>
-            <w:tcMar>
-              <w:top w:type="dxa" w:w="90"/>
-              <w:left w:type="dxa" w:w="110"/>
-              <w:bottom w:type="dxa" w:w="90"/>
-              <w:right w:type="dxa" w:w="110"/>
-            </w:tcMar>
-            <w:vAlign w:val="center"/>
-          </w:tcPr>
-          <w:p>
-            <w:pPr>
-              <w:keepLines/>
-              <w:spacing w:after="0" w:line="250"/>
-              <w:jc w:val="left"/>
-            </w:pPr>
-            <w:r>
-              <w:rPr>
-                <w:rFonts w:ascii="Calibri" w:cs="Calibri" w:eastAsia="Calibri" w:hAnsi="Calibri"/>
-                <w:b w:val="false"/>
-                <w:bCs w:val="false"/>
-                <w:color w:val="000000"/>
-                <w:sz w:val="19"/>
-                <w:szCs w:val="19"/>
-              </w:rPr>
-              <w:t xml:space="preserve">[Evidence archive reference]</w:t>
-            </w:r>
-          </w:p>
-        </w:tc>
-      </w:tr>
-    </w:tbl>
-    <w:p>
-      <w:pPr>
-        <w:spacing w:after="100"/>
-      </w:pPr>
+        <w:t xml:space="preserve">The execution observations in this report are limited to the four turbine-mode </w:t>
+      </w:r>
+      <w:r>
+        <w:rPr>
+          <w:rFonts w:ascii="Calibri" w:cs="Calibri" w:eastAsia="Calibri" w:hAnsi="Calibri"/>
+          <w:color w:val="000000"/>
+          <w:sz w:val="22"/>
+          <w:szCs w:val="22"/>
+        </w:rPr>
+        <w:t xml:space="preserve">.OUT</w:t>
+      </w:r>
+      <w:r>
+        <w:rPr>
+          <w:rFonts w:ascii="Calibri" w:cs="Calibri" w:eastAsia="Calibri" w:hAnsi="Calibri"/>
+          <w:color w:val="000000"/>
+          <w:sz w:val="22"/>
+          <w:szCs w:val="22"/>
+        </w:rPr>
+        <w:t xml:space="preserve"> files supplied by the project team. They do not establish verification of every application feature, deployment configuration, or engineering result.</w:t>
+      </w:r>
     </w:p>
     <w:p>
       <w:pPr>
@@ -8040,7 +6080,7 @@
           <w:sz w:val="22"/>
           <w:szCs w:val="22"/>
         </w:rPr>
-        <w:t xml:space="preserve">Built-in turbine-curve estimates must be checked against verified manufacturer/project data.</w:t>
+        <w:t xml:space="preserve">Built-in turbine-curve estimates are not a substitute for verified manufacturer or project data.</w:t>
       </w:r>
     </w:p>
     <w:p>
@@ -8067,7 +6107,7 @@
           <w:sz w:val="22"/>
           <w:szCs w:val="22"/>
         </w:rPr>
-        <w:t xml:space="preserve">Operation labels and generated syntax must be checked against the exact WHAMO version used.</w:t>
+        <w:t xml:space="preserve">Operation labels and generated syntax may vary in compatibility across WHAMO versions.</w:t>
       </w:r>
     </w:p>
     <w:p>
@@ -8121,7 +6161,7 @@
           <w:sz w:val="22"/>
           <w:szCs w:val="22"/>
         </w:rPr>
-        <w:t xml:space="preserve">Server-side execution depends on the approved executable being available and compatible with the server runtime. Confirm licensing and distribution rights before packaging or deploying the executable.</w:t>
+        <w:t xml:space="preserve">Server-side execution depends on a WHAMO executable being available and compatible with the server runtime. Executable licensing and distribution rights are separate from application functionality.</w:t>
       </w:r>
     </w:p>
     <w:p>
@@ -8148,7 +6188,7 @@
           <w:sz w:val="22"/>
           <w:szCs w:val="22"/>
         </w:rPr>
-        <w:t xml:space="preserve">The final deployed version, database, security settings, and user permissions must be verified in the actual handover environment.</w:t>
+        <w:t xml:space="preserve">The final deployment's database, security settings, and user permissions are environment-specific and are not established by the supplied test files.</w:t>
       </w:r>
     </w:p>
     <w:p>
@@ -8159,766 +6199,7 @@
         <w:spacing w:after="120" w:before="210"/>
       </w:pPr>
       <w:r>
-        <w:t xml:space="preserve">9.2 Handover package</w:t>
-      </w:r>
-    </w:p>
-    <w:tbl>
-      <w:tblPr>
-        <w:tblW w:type="dxa" w:w="9638"/>
-        <w:tblBorders>
-          <w:top w:val="single" w:color="B7B7B7" w:sz="5"/>
-          <w:left w:val="single" w:color="B7B7B7" w:sz="5"/>
-          <w:bottom w:val="single" w:color="B7B7B7" w:sz="5"/>
-          <w:right w:val="single" w:color="B7B7B7" w:sz="5"/>
-          <w:insideH w:val="single" w:color="B7B7B7" w:sz="5"/>
-          <w:insideV w:val="single" w:color="B7B7B7" w:sz="5"/>
-        </w:tblBorders>
-        <w:tblCellMar>
-          <w:top w:type="dxa" w:w="90"/>
-          <w:left w:type="dxa" w:w="110"/>
-          <w:bottom w:type="dxa" w:w="90"/>
-          <w:right w:type="dxa" w:w="110"/>
-        </w:tblCellMar>
-      </w:tblPr>
-      <w:tblGrid>
-        <w:gridCol w:w="4819"/>
-        <w:gridCol w:w="4819"/>
-      </w:tblGrid>
-      <w:tr>
-        <w:trPr>
-          <w:cantSplit/>
-          <w:tblHeader/>
-        </w:trPr>
-        <w:tc>
-          <w:tcPr>
-            <w:tcW w:type="dxa" w:w="4819"/>
-            <w:tcBorders>
-              <w:top w:val="single" w:color="B7B7B7" w:sz="5"/>
-              <w:left w:val="single" w:color="B7B7B7" w:sz="5"/>
-              <w:bottom w:val="single" w:color="B7B7B7" w:sz="5"/>
-              <w:right w:val="single" w:color="B7B7B7" w:sz="5"/>
-            </w:tcBorders>
-            <w:shd w:fill="E6E6E6" w:val="clear"/>
-            <w:tcMar>
-              <w:top w:type="dxa" w:w="90"/>
-              <w:left w:type="dxa" w:w="110"/>
-              <w:bottom w:type="dxa" w:w="90"/>
-              <w:right w:type="dxa" w:w="110"/>
-            </w:tcMar>
-            <w:vAlign w:val="center"/>
-          </w:tcPr>
-          <w:p>
-            <w:pPr>
-              <w:keepLines/>
-              <w:spacing w:after="0" w:line="250"/>
-              <w:jc w:val="left"/>
-            </w:pPr>
-            <w:r>
-              <w:rPr>
-                <w:rFonts w:ascii="Calibri" w:cs="Calibri" w:eastAsia="Calibri" w:hAnsi="Calibri"/>
-                <w:b/>
-                <w:bCs/>
-                <w:color w:val="000000"/>
-                <w:sz w:val="19"/>
-                <w:szCs w:val="19"/>
-              </w:rPr>
-              <w:t xml:space="preserve">Item</w:t>
-            </w:r>
-          </w:p>
-        </w:tc>
-        <w:tc>
-          <w:tcPr>
-            <w:tcW w:type="dxa" w:w="4819"/>
-            <w:tcBorders>
-              <w:top w:val="single" w:color="B7B7B7" w:sz="5"/>
-              <w:left w:val="single" w:color="B7B7B7" w:sz="5"/>
-              <w:bottom w:val="single" w:color="B7B7B7" w:sz="5"/>
-              <w:right w:val="single" w:color="B7B7B7" w:sz="5"/>
-            </w:tcBorders>
-            <w:shd w:fill="E6E6E6" w:val="clear"/>
-            <w:tcMar>
-              <w:top w:type="dxa" w:w="90"/>
-              <w:left w:type="dxa" w:w="110"/>
-              <w:bottom w:type="dxa" w:w="90"/>
-              <w:right w:type="dxa" w:w="110"/>
-            </w:tcMar>
-            <w:vAlign w:val="center"/>
-          </w:tcPr>
-          <w:p>
-            <w:pPr>
-              <w:keepLines/>
-              <w:spacing w:after="0" w:line="250"/>
-              <w:jc w:val="left"/>
-            </w:pPr>
-            <w:r>
-              <w:rPr>
-                <w:rFonts w:ascii="Calibri" w:cs="Calibri" w:eastAsia="Calibri" w:hAnsi="Calibri"/>
-                <w:b/>
-                <w:bCs/>
-                <w:color w:val="000000"/>
-                <w:sz w:val="19"/>
-                <w:szCs w:val="19"/>
-              </w:rPr>
-              <w:t xml:space="preserve">Handover reference</w:t>
-            </w:r>
-          </w:p>
-        </w:tc>
-      </w:tr>
-      <w:tr>
-        <w:trPr>
-          <w:cantSplit/>
-          <w:tblHeader w:val="false"/>
-        </w:trPr>
-        <w:tc>
-          <w:tcPr>
-            <w:tcW w:type="dxa" w:w="4819"/>
-            <w:tcBorders>
-              <w:top w:val="single" w:color="B7B7B7" w:sz="5"/>
-              <w:left w:val="single" w:color="B7B7B7" w:sz="5"/>
-              <w:bottom w:val="single" w:color="B7B7B7" w:sz="5"/>
-              <w:right w:val="single" w:color="B7B7B7" w:sz="5"/>
-            </w:tcBorders>
-            <w:shd w:fill="FFFFFF" w:val="clear"/>
-            <w:tcMar>
-              <w:top w:type="dxa" w:w="90"/>
-              <w:left w:type="dxa" w:w="110"/>
-              <w:bottom w:type="dxa" w:w="90"/>
-              <w:right w:type="dxa" w:w="110"/>
-            </w:tcMar>
-            <w:vAlign w:val="center"/>
-          </w:tcPr>
-          <w:p>
-            <w:pPr>
-              <w:keepLines/>
-              <w:spacing w:after="0" w:line="250"/>
-              <w:jc w:val="left"/>
-            </w:pPr>
-            <w:r>
-              <w:rPr>
-                <w:rFonts w:ascii="Calibri" w:cs="Calibri" w:eastAsia="Calibri" w:hAnsi="Calibri"/>
-                <w:b w:val="false"/>
-                <w:bCs w:val="false"/>
-                <w:color w:val="000000"/>
-                <w:sz w:val="19"/>
-                <w:szCs w:val="19"/>
-              </w:rPr>
-              <w:t xml:space="preserve">Application source code and exact revision</w:t>
-            </w:r>
-          </w:p>
-        </w:tc>
-        <w:tc>
-          <w:tcPr>
-            <w:tcW w:type="dxa" w:w="4819"/>
-            <w:tcBorders>
-              <w:top w:val="single" w:color="B7B7B7" w:sz="5"/>
-              <w:left w:val="single" w:color="B7B7B7" w:sz="5"/>
-              <w:bottom w:val="single" w:color="B7B7B7" w:sz="5"/>
-              <w:right w:val="single" w:color="B7B7B7" w:sz="5"/>
-            </w:tcBorders>
-            <w:shd w:fill="FFFFFF" w:val="clear"/>
-            <w:tcMar>
-              <w:top w:type="dxa" w:w="90"/>
-              <w:left w:type="dxa" w:w="110"/>
-              <w:bottom w:type="dxa" w:w="90"/>
-              <w:right w:type="dxa" w:w="110"/>
-            </w:tcMar>
-            <w:vAlign w:val="center"/>
-          </w:tcPr>
-          <w:p>
-            <w:pPr>
-              <w:keepLines/>
-              <w:spacing w:after="0" w:line="250"/>
-              <w:jc w:val="left"/>
-            </w:pPr>
-            <w:r>
-              <w:rPr>
-                <w:rFonts w:ascii="Calibri" w:cs="Calibri" w:eastAsia="Calibri" w:hAnsi="Calibri"/>
-                <w:b w:val="false"/>
-                <w:bCs w:val="false"/>
-                <w:color w:val="000000"/>
-                <w:sz w:val="19"/>
-                <w:szCs w:val="19"/>
-              </w:rPr>
-              <w:t xml:space="preserve">[Repository/archive/checksum]</w:t>
-            </w:r>
-          </w:p>
-        </w:tc>
-      </w:tr>
-      <w:tr>
-        <w:trPr>
-          <w:cantSplit/>
-          <w:tblHeader w:val="false"/>
-        </w:trPr>
-        <w:tc>
-          <w:tcPr>
-            <w:tcW w:type="dxa" w:w="4819"/>
-            <w:tcBorders>
-              <w:top w:val="single" w:color="B7B7B7" w:sz="5"/>
-              <w:left w:val="single" w:color="B7B7B7" w:sz="5"/>
-              <w:bottom w:val="single" w:color="B7B7B7" w:sz="5"/>
-              <w:right w:val="single" w:color="B7B7B7" w:sz="5"/>
-            </w:tcBorders>
-            <w:shd w:fill="F7F7F7" w:val="clear"/>
-            <w:tcMar>
-              <w:top w:type="dxa" w:w="90"/>
-              <w:left w:type="dxa" w:w="110"/>
-              <w:bottom w:type="dxa" w:w="90"/>
-              <w:right w:type="dxa" w:w="110"/>
-            </w:tcMar>
-            <w:vAlign w:val="center"/>
-          </w:tcPr>
-          <w:p>
-            <w:pPr>
-              <w:keepLines/>
-              <w:spacing w:after="0" w:line="250"/>
-              <w:jc w:val="left"/>
-            </w:pPr>
-            <w:r>
-              <w:rPr>
-                <w:rFonts w:ascii="Calibri" w:cs="Calibri" w:eastAsia="Calibri" w:hAnsi="Calibri"/>
-                <w:b w:val="false"/>
-                <w:bCs w:val="false"/>
-                <w:color w:val="000000"/>
-                <w:sz w:val="19"/>
-                <w:szCs w:val="19"/>
-              </w:rPr>
-              <w:t xml:space="preserve">User manual</w:t>
-            </w:r>
-          </w:p>
-        </w:tc>
-        <w:tc>
-          <w:tcPr>
-            <w:tcW w:type="dxa" w:w="4819"/>
-            <w:tcBorders>
-              <w:top w:val="single" w:color="B7B7B7" w:sz="5"/>
-              <w:left w:val="single" w:color="B7B7B7" w:sz="5"/>
-              <w:bottom w:val="single" w:color="B7B7B7" w:sz="5"/>
-              <w:right w:val="single" w:color="B7B7B7" w:sz="5"/>
-            </w:tcBorders>
-            <w:shd w:fill="F7F7F7" w:val="clear"/>
-            <w:tcMar>
-              <w:top w:type="dxa" w:w="90"/>
-              <w:left w:type="dxa" w:w="110"/>
-              <w:bottom w:type="dxa" w:w="90"/>
-              <w:right w:type="dxa" w:w="110"/>
-            </w:tcMar>
-            <w:vAlign w:val="center"/>
-          </w:tcPr>
-          <w:p>
-            <w:pPr>
-              <w:keepLines/>
-              <w:spacing w:after="0" w:line="250"/>
-              <w:jc w:val="left"/>
-            </w:pPr>
-            <w:r>
-              <w:rPr>
-                <w:rFonts w:ascii="Calibri" w:cs="Calibri" w:eastAsia="Calibri" w:hAnsi="Calibri"/>
-                <w:b w:val="false"/>
-                <w:bCs w:val="false"/>
-                <w:color w:val="000000"/>
-                <w:sz w:val="19"/>
-                <w:szCs w:val="19"/>
-              </w:rPr>
-              <w:t xml:space="preserve">Reports/WHAMO_Network_Designer_User_Manual.docx and source Markdown</w:t>
-            </w:r>
-          </w:p>
-        </w:tc>
-      </w:tr>
-      <w:tr>
-        <w:trPr>
-          <w:cantSplit/>
-          <w:tblHeader w:val="false"/>
-        </w:trPr>
-        <w:tc>
-          <w:tcPr>
-            <w:tcW w:type="dxa" w:w="4819"/>
-            <w:tcBorders>
-              <w:top w:val="single" w:color="B7B7B7" w:sz="5"/>
-              <w:left w:val="single" w:color="B7B7B7" w:sz="5"/>
-              <w:bottom w:val="single" w:color="B7B7B7" w:sz="5"/>
-              <w:right w:val="single" w:color="B7B7B7" w:sz="5"/>
-            </w:tcBorders>
-            <w:shd w:fill="FFFFFF" w:val="clear"/>
-            <w:tcMar>
-              <w:top w:type="dxa" w:w="90"/>
-              <w:left w:type="dxa" w:w="110"/>
-              <w:bottom w:type="dxa" w:w="90"/>
-              <w:right w:type="dxa" w:w="110"/>
-            </w:tcMar>
-            <w:vAlign w:val="center"/>
-          </w:tcPr>
-          <w:p>
-            <w:pPr>
-              <w:keepLines/>
-              <w:spacing w:after="0" w:line="250"/>
-              <w:jc w:val="left"/>
-            </w:pPr>
-            <w:r>
-              <w:rPr>
-                <w:rFonts w:ascii="Calibri" w:cs="Calibri" w:eastAsia="Calibri" w:hAnsi="Calibri"/>
-                <w:b w:val="false"/>
-                <w:bCs w:val="false"/>
-                <w:color w:val="000000"/>
-                <w:sz w:val="19"/>
-                <w:szCs w:val="19"/>
-              </w:rPr>
-              <w:t xml:space="preserve">Detailed project report</w:t>
-            </w:r>
-          </w:p>
-        </w:tc>
-        <w:tc>
-          <w:tcPr>
-            <w:tcW w:type="dxa" w:w="4819"/>
-            <w:tcBorders>
-              <w:top w:val="single" w:color="B7B7B7" w:sz="5"/>
-              <w:left w:val="single" w:color="B7B7B7" w:sz="5"/>
-              <w:bottom w:val="single" w:color="B7B7B7" w:sz="5"/>
-              <w:right w:val="single" w:color="B7B7B7" w:sz="5"/>
-            </w:tcBorders>
-            <w:shd w:fill="FFFFFF" w:val="clear"/>
-            <w:tcMar>
-              <w:top w:type="dxa" w:w="90"/>
-              <w:left w:type="dxa" w:w="110"/>
-              <w:bottom w:type="dxa" w:w="90"/>
-              <w:right w:type="dxa" w:w="110"/>
-            </w:tcMar>
-            <w:vAlign w:val="center"/>
-          </w:tcPr>
-          <w:p>
-            <w:pPr>
-              <w:keepLines/>
-              <w:spacing w:after="0" w:line="250"/>
-              <w:jc w:val="left"/>
-            </w:pPr>
-            <w:r>
-              <w:rPr>
-                <w:rFonts w:ascii="Calibri" w:cs="Calibri" w:eastAsia="Calibri" w:hAnsi="Calibri"/>
-                <w:b w:val="false"/>
-                <w:bCs w:val="false"/>
-                <w:color w:val="000000"/>
-                <w:sz w:val="19"/>
-                <w:szCs w:val="19"/>
-              </w:rPr>
-              <w:t xml:space="preserve">This report and its signed final copy</w:t>
-            </w:r>
-          </w:p>
-        </w:tc>
-      </w:tr>
-      <w:tr>
-        <w:trPr>
-          <w:cantSplit/>
-          <w:tblHeader w:val="false"/>
-        </w:trPr>
-        <w:tc>
-          <w:tcPr>
-            <w:tcW w:type="dxa" w:w="4819"/>
-            <w:tcBorders>
-              <w:top w:val="single" w:color="B7B7B7" w:sz="5"/>
-              <w:left w:val="single" w:color="B7B7B7" w:sz="5"/>
-              <w:bottom w:val="single" w:color="B7B7B7" w:sz="5"/>
-              <w:right w:val="single" w:color="B7B7B7" w:sz="5"/>
-            </w:tcBorders>
-            <w:shd w:fill="F7F7F7" w:val="clear"/>
-            <w:tcMar>
-              <w:top w:type="dxa" w:w="90"/>
-              <w:left w:type="dxa" w:w="110"/>
-              <w:bottom w:type="dxa" w:w="90"/>
-              <w:right w:type="dxa" w:w="110"/>
-            </w:tcMar>
-            <w:vAlign w:val="center"/>
-          </w:tcPr>
-          <w:p>
-            <w:pPr>
-              <w:keepLines/>
-              <w:spacing w:after="0" w:line="250"/>
-              <w:jc w:val="left"/>
-            </w:pPr>
-            <w:r>
-              <w:rPr>
-                <w:rFonts w:ascii="Calibri" w:cs="Calibri" w:eastAsia="Calibri" w:hAnsi="Calibri"/>
-                <w:b w:val="false"/>
-                <w:bCs w:val="false"/>
-                <w:color w:val="000000"/>
-                <w:sz w:val="19"/>
-                <w:szCs w:val="19"/>
-              </w:rPr>
-              <w:t xml:space="preserve">Approved .INP and .OUT test evidence</w:t>
-            </w:r>
-          </w:p>
-        </w:tc>
-        <w:tc>
-          <w:tcPr>
-            <w:tcW w:type="dxa" w:w="4819"/>
-            <w:tcBorders>
-              <w:top w:val="single" w:color="B7B7B7" w:sz="5"/>
-              <w:left w:val="single" w:color="B7B7B7" w:sz="5"/>
-              <w:bottom w:val="single" w:color="B7B7B7" w:sz="5"/>
-              <w:right w:val="single" w:color="B7B7B7" w:sz="5"/>
-            </w:tcBorders>
-            <w:shd w:fill="F7F7F7" w:val="clear"/>
-            <w:tcMar>
-              <w:top w:type="dxa" w:w="90"/>
-              <w:left w:type="dxa" w:w="110"/>
-              <w:bottom w:type="dxa" w:w="90"/>
-              <w:right w:type="dxa" w:w="110"/>
-            </w:tcMar>
-            <w:vAlign w:val="center"/>
-          </w:tcPr>
-          <w:p>
-            <w:pPr>
-              <w:keepLines/>
-              <w:spacing w:after="0" w:line="250"/>
-              <w:jc w:val="left"/>
-            </w:pPr>
-            <w:r>
-              <w:rPr>
-                <w:rFonts w:ascii="Calibri" w:cs="Calibri" w:eastAsia="Calibri" w:hAnsi="Calibri"/>
-                <w:b w:val="false"/>
-                <w:bCs w:val="false"/>
-                <w:color w:val="000000"/>
-                <w:sz w:val="19"/>
-                <w:szCs w:val="19"/>
-              </w:rPr>
-              <w:t xml:space="preserve">[Evidence archive]</w:t>
-            </w:r>
-          </w:p>
-        </w:tc>
-      </w:tr>
-      <w:tr>
-        <w:trPr>
-          <w:cantSplit/>
-          <w:tblHeader w:val="false"/>
-        </w:trPr>
-        <w:tc>
-          <w:tcPr>
-            <w:tcW w:type="dxa" w:w="4819"/>
-            <w:tcBorders>
-              <w:top w:val="single" w:color="B7B7B7" w:sz="5"/>
-              <w:left w:val="single" w:color="B7B7B7" w:sz="5"/>
-              <w:bottom w:val="single" w:color="B7B7B7" w:sz="5"/>
-              <w:right w:val="single" w:color="B7B7B7" w:sz="5"/>
-            </w:tcBorders>
-            <w:shd w:fill="FFFFFF" w:val="clear"/>
-            <w:tcMar>
-              <w:top w:type="dxa" w:w="90"/>
-              <w:left w:type="dxa" w:w="110"/>
-              <w:bottom w:type="dxa" w:w="90"/>
-              <w:right w:type="dxa" w:w="110"/>
-            </w:tcMar>
-            <w:vAlign w:val="center"/>
-          </w:tcPr>
-          <w:p>
-            <w:pPr>
-              <w:keepLines/>
-              <w:spacing w:after="0" w:line="250"/>
-              <w:jc w:val="left"/>
-            </w:pPr>
-            <w:r>
-              <w:rPr>
-                <w:rFonts w:ascii="Calibri" w:cs="Calibri" w:eastAsia="Calibri" w:hAnsi="Calibri"/>
-                <w:b w:val="false"/>
-                <w:bCs w:val="false"/>
-                <w:color w:val="000000"/>
-                <w:sz w:val="19"/>
-                <w:szCs w:val="19"/>
-              </w:rPr>
-              <w:t xml:space="preserve">Monthly progress reports</w:t>
-            </w:r>
-          </w:p>
-        </w:tc>
-        <w:tc>
-          <w:tcPr>
-            <w:tcW w:type="dxa" w:w="4819"/>
-            <w:tcBorders>
-              <w:top w:val="single" w:color="B7B7B7" w:sz="5"/>
-              <w:left w:val="single" w:color="B7B7B7" w:sz="5"/>
-              <w:bottom w:val="single" w:color="B7B7B7" w:sz="5"/>
-              <w:right w:val="single" w:color="B7B7B7" w:sz="5"/>
-            </w:tcBorders>
-            <w:shd w:fill="FFFFFF" w:val="clear"/>
-            <w:tcMar>
-              <w:top w:type="dxa" w:w="90"/>
-              <w:left w:type="dxa" w:w="110"/>
-              <w:bottom w:type="dxa" w:w="90"/>
-              <w:right w:type="dxa" w:w="110"/>
-            </w:tcMar>
-            <w:vAlign w:val="center"/>
-          </w:tcPr>
-          <w:p>
-            <w:pPr>
-              <w:keepLines/>
-              <w:spacing w:after="0" w:line="250"/>
-              <w:jc w:val="left"/>
-            </w:pPr>
-            <w:r>
-              <w:rPr>
-                <w:rFonts w:ascii="Calibri" w:cs="Calibri" w:eastAsia="Calibri" w:hAnsi="Calibri"/>
-                <w:b w:val="false"/>
-                <w:bCs w:val="false"/>
-                <w:color w:val="000000"/>
-                <w:sz w:val="19"/>
-                <w:szCs w:val="19"/>
-              </w:rPr>
-              <w:t xml:space="preserve">[Report range/archive]</w:t>
-            </w:r>
-          </w:p>
-        </w:tc>
-      </w:tr>
-      <w:tr>
-        <w:trPr>
-          <w:cantSplit/>
-          <w:tblHeader w:val="false"/>
-        </w:trPr>
-        <w:tc>
-          <w:tcPr>
-            <w:tcW w:type="dxa" w:w="4819"/>
-            <w:tcBorders>
-              <w:top w:val="single" w:color="B7B7B7" w:sz="5"/>
-              <w:left w:val="single" w:color="B7B7B7" w:sz="5"/>
-              <w:bottom w:val="single" w:color="B7B7B7" w:sz="5"/>
-              <w:right w:val="single" w:color="B7B7B7" w:sz="5"/>
-            </w:tcBorders>
-            <w:shd w:fill="F7F7F7" w:val="clear"/>
-            <w:tcMar>
-              <w:top w:type="dxa" w:w="90"/>
-              <w:left w:type="dxa" w:w="110"/>
-              <w:bottom w:type="dxa" w:w="90"/>
-              <w:right w:type="dxa" w:w="110"/>
-            </w:tcMar>
-            <w:vAlign w:val="center"/>
-          </w:tcPr>
-          <w:p>
-            <w:pPr>
-              <w:keepLines/>
-              <w:spacing w:after="0" w:line="250"/>
-              <w:jc w:val="left"/>
-            </w:pPr>
-            <w:r>
-              <w:rPr>
-                <w:rFonts w:ascii="Calibri" w:cs="Calibri" w:eastAsia="Calibri" w:hAnsi="Calibri"/>
-                <w:b w:val="false"/>
-                <w:bCs w:val="false"/>
-                <w:color w:val="000000"/>
-                <w:sz w:val="19"/>
-                <w:szCs w:val="19"/>
-              </w:rPr>
-              <w:t xml:space="preserve">Open-source acknowledgements and notices</w:t>
-            </w:r>
-          </w:p>
-        </w:tc>
-        <w:tc>
-          <w:tcPr>
-            <w:tcW w:type="dxa" w:w="4819"/>
-            <w:tcBorders>
-              <w:top w:val="single" w:color="B7B7B7" w:sz="5"/>
-              <w:left w:val="single" w:color="B7B7B7" w:sz="5"/>
-              <w:bottom w:val="single" w:color="B7B7B7" w:sz="5"/>
-              <w:right w:val="single" w:color="B7B7B7" w:sz="5"/>
-            </w:tcBorders>
-            <w:shd w:fill="F7F7F7" w:val="clear"/>
-            <w:tcMar>
-              <w:top w:type="dxa" w:w="90"/>
-              <w:left w:type="dxa" w:w="110"/>
-              <w:bottom w:type="dxa" w:w="90"/>
-              <w:right w:type="dxa" w:w="110"/>
-            </w:tcMar>
-            <w:vAlign w:val="center"/>
-          </w:tcPr>
-          <w:p>
-            <w:pPr>
-              <w:keepLines/>
-              <w:spacing w:after="0" w:line="250"/>
-              <w:jc w:val="left"/>
-            </w:pPr>
-            <w:r>
-              <w:rPr>
-                <w:rFonts w:ascii="Calibri" w:cs="Calibri" w:eastAsia="Calibri" w:hAnsi="Calibri"/>
-                <w:b w:val="false"/>
-                <w:bCs w:val="false"/>
-                <w:color w:val="000000"/>
-                <w:sz w:val="19"/>
-                <w:szCs w:val="19"/>
-              </w:rPr>
-              <w:t xml:space="preserve">Reports/Open_Source_Acknowledgements.md plus required packaged notices</w:t>
-            </w:r>
-          </w:p>
-        </w:tc>
-      </w:tr>
-      <w:tr>
-        <w:trPr>
-          <w:cantSplit/>
-          <w:tblHeader w:val="false"/>
-        </w:trPr>
-        <w:tc>
-          <w:tcPr>
-            <w:tcW w:type="dxa" w:w="4819"/>
-            <w:tcBorders>
-              <w:top w:val="single" w:color="B7B7B7" w:sz="5"/>
-              <w:left w:val="single" w:color="B7B7B7" w:sz="5"/>
-              <w:bottom w:val="single" w:color="B7B7B7" w:sz="5"/>
-              <w:right w:val="single" w:color="B7B7B7" w:sz="5"/>
-            </w:tcBorders>
-            <w:shd w:fill="FFFFFF" w:val="clear"/>
-            <w:tcMar>
-              <w:top w:type="dxa" w:w="90"/>
-              <w:left w:type="dxa" w:w="110"/>
-              <w:bottom w:type="dxa" w:w="90"/>
-              <w:right w:type="dxa" w:w="110"/>
-            </w:tcMar>
-            <w:vAlign w:val="center"/>
-          </w:tcPr>
-          <w:p>
-            <w:pPr>
-              <w:keepLines/>
-              <w:spacing w:after="0" w:line="250"/>
-              <w:jc w:val="left"/>
-            </w:pPr>
-            <w:r>
-              <w:rPr>
-                <w:rFonts w:ascii="Calibri" w:cs="Calibri" w:eastAsia="Calibri" w:hAnsi="Calibri"/>
-                <w:b w:val="false"/>
-                <w:bCs w:val="false"/>
-                <w:color w:val="000000"/>
-                <w:sz w:val="19"/>
-                <w:szCs w:val="19"/>
-              </w:rPr>
-              <w:t xml:space="preserve">Team responsibility declarations</w:t>
-            </w:r>
-          </w:p>
-        </w:tc>
-        <w:tc>
-          <w:tcPr>
-            <w:tcW w:type="dxa" w:w="4819"/>
-            <w:tcBorders>
-              <w:top w:val="single" w:color="B7B7B7" w:sz="5"/>
-              <w:left w:val="single" w:color="B7B7B7" w:sz="5"/>
-              <w:bottom w:val="single" w:color="B7B7B7" w:sz="5"/>
-              <w:right w:val="single" w:color="B7B7B7" w:sz="5"/>
-            </w:tcBorders>
-            <w:shd w:fill="FFFFFF" w:val="clear"/>
-            <w:tcMar>
-              <w:top w:type="dxa" w:w="90"/>
-              <w:left w:type="dxa" w:w="110"/>
-              <w:bottom w:type="dxa" w:w="90"/>
-              <w:right w:type="dxa" w:w="110"/>
-            </w:tcMar>
-            <w:vAlign w:val="center"/>
-          </w:tcPr>
-          <w:p>
-            <w:pPr>
-              <w:keepLines/>
-              <w:spacing w:after="0" w:line="250"/>
-              <w:jc w:val="left"/>
-            </w:pPr>
-            <w:r>
-              <w:rPr>
-                <w:rFonts w:ascii="Calibri" w:cs="Calibri" w:eastAsia="Calibri" w:hAnsi="Calibri"/>
-                <w:b w:val="false"/>
-                <w:bCs w:val="false"/>
-                <w:color w:val="000000"/>
-                <w:sz w:val="19"/>
-                <w:szCs w:val="19"/>
-              </w:rPr>
-              <w:t xml:space="preserve">[Approved signed copies]</w:t>
-            </w:r>
-          </w:p>
-        </w:tc>
-      </w:tr>
-      <w:tr>
-        <w:trPr>
-          <w:cantSplit/>
-          <w:tblHeader w:val="false"/>
-        </w:trPr>
-        <w:tc>
-          <w:tcPr>
-            <w:tcW w:type="dxa" w:w="4819"/>
-            <w:tcBorders>
-              <w:top w:val="single" w:color="B7B7B7" w:sz="5"/>
-              <w:left w:val="single" w:color="B7B7B7" w:sz="5"/>
-              <w:bottom w:val="single" w:color="B7B7B7" w:sz="5"/>
-              <w:right w:val="single" w:color="B7B7B7" w:sz="5"/>
-            </w:tcBorders>
-            <w:shd w:fill="F7F7F7" w:val="clear"/>
-            <w:tcMar>
-              <w:top w:type="dxa" w:w="90"/>
-              <w:left w:type="dxa" w:w="110"/>
-              <w:bottom w:type="dxa" w:w="90"/>
-              <w:right w:type="dxa" w:w="110"/>
-            </w:tcMar>
-            <w:vAlign w:val="center"/>
-          </w:tcPr>
-          <w:p>
-            <w:pPr>
-              <w:keepLines/>
-              <w:spacing w:after="0" w:line="250"/>
-              <w:jc w:val="left"/>
-            </w:pPr>
-            <w:r>
-              <w:rPr>
-                <w:rFonts w:ascii="Calibri" w:cs="Calibri" w:eastAsia="Calibri" w:hAnsi="Calibri"/>
-                <w:b w:val="false"/>
-                <w:bCs w:val="false"/>
-                <w:color w:val="000000"/>
-                <w:sz w:val="19"/>
-                <w:szCs w:val="19"/>
-              </w:rPr>
-              <w:t xml:space="preserve">WHAMO executable/version and operating instructions</w:t>
-            </w:r>
-          </w:p>
-        </w:tc>
-        <w:tc>
-          <w:tcPr>
-            <w:tcW w:type="dxa" w:w="4819"/>
-            <w:tcBorders>
-              <w:top w:val="single" w:color="B7B7B7" w:sz="5"/>
-              <w:left w:val="single" w:color="B7B7B7" w:sz="5"/>
-              <w:bottom w:val="single" w:color="B7B7B7" w:sz="5"/>
-              <w:right w:val="single" w:color="B7B7B7" w:sz="5"/>
-            </w:tcBorders>
-            <w:shd w:fill="F7F7F7" w:val="clear"/>
-            <w:tcMar>
-              <w:top w:type="dxa" w:w="90"/>
-              <w:left w:type="dxa" w:w="110"/>
-              <w:bottom w:type="dxa" w:w="90"/>
-              <w:right w:type="dxa" w:w="110"/>
-            </w:tcMar>
-            <w:vAlign w:val="center"/>
-          </w:tcPr>
-          <w:p>
-            <w:pPr>
-              <w:keepLines/>
-              <w:spacing w:after="0" w:line="250"/>
-              <w:jc w:val="left"/>
-            </w:pPr>
-            <w:r>
-              <w:rPr>
-                <w:rFonts w:ascii="Calibri" w:cs="Calibri" w:eastAsia="Calibri" w:hAnsi="Calibri"/>
-                <w:b w:val="false"/>
-                <w:bCs w:val="false"/>
-                <w:color w:val="000000"/>
-                <w:sz w:val="19"/>
-                <w:szCs w:val="19"/>
-              </w:rPr>
-              <w:t xml:space="preserve">[Authorized reference; do not include unlicensed copies]</w:t>
-            </w:r>
-          </w:p>
-        </w:tc>
-      </w:tr>
-    </w:tbl>
-    <w:p>
-      <w:pPr>
-        <w:spacing w:after="100"/>
-      </w:pPr>
-    </w:p>
-    <w:p>
-      <w:pPr>
-        <w:pStyle w:val="Heading3"/>
-        <w:keepNext/>
-        <w:keepLines/>
-        <w:spacing w:after="120" w:before="210"/>
-      </w:pPr>
-      <w:r>
-        <w:t xml:space="preserve">9.3 Conclusion</w:t>
+        <w:t xml:space="preserve">9.2 Conclusion</w:t>
       </w:r>
     </w:p>
     <w:p>
@@ -8950,7 +6231,7 @@
           <w:sz w:val="22"/>
           <w:szCs w:val="22"/>
         </w:rPr>
-        <w:t xml:space="preserve">The source describes the current interface and calculation paths, but the available execution evidence is mixed: the GENERATE and OFF samples show no input errors and a normal end marker; the REJECT sample contains 3,594 computational warnings; and the STARTUP sample lacks a normal end marker. The team should attach complete, reviewed test evidence and record how the outstanding findings were resolved or accepted before the report is countersigned.</w:t>
+        <w:t xml:space="preserve">The available execution evidence is mixed: the GENERATE and OFF samples show no input errors and a normal end marker; the REJECT sample contains 3,594 computational warnings; and the STARTUP sample lacks a normal end marker.</w:t>
       </w:r>
     </w:p>
     <w:p>
@@ -8992,7 +6273,7 @@
           <w:sz w:val="22"/>
           <w:szCs w:val="22"/>
         </w:rPr>
-        <w:t xml:space="preserve">WHAMO Network Designer current source and release: [record exact revision and archive/checksum].</w:t>
+        <w:t xml:space="preserve">WHAMO Network Designer project source.</w:t>
       </w:r>
     </w:p>
     <w:p>
@@ -9019,25 +6300,7 @@
           <w:sz w:val="22"/>
           <w:szCs w:val="22"/>
         </w:rPr>
-        <w:t xml:space="preserve">WHAMO Network Designer User Manual: </w:t>
-      </w:r>
-      <w:r>
-        <w:rPr>
-          <w:rFonts w:ascii="Calibri" w:cs="Calibri" w:eastAsia="Calibri" w:hAnsi="Calibri"/>
-          <w:color w:val="000000"/>
-          <w:sz w:val="22"/>
-          <w:szCs w:val="22"/>
-        </w:rPr>
-        <w:t xml:space="preserve">Reports/USER_MANUAL.md</w:t>
-      </w:r>
-      <w:r>
-        <w:rPr>
-          <w:rFonts w:ascii="Calibri" w:cs="Calibri" w:eastAsia="Calibri" w:hAnsi="Calibri"/>
-          <w:color w:val="000000"/>
-          <w:sz w:val="22"/>
-          <w:szCs w:val="22"/>
-        </w:rPr>
-        <w:t xml:space="preserve"> and approved final document.</w:t>
+        <w:t xml:space="preserve">WHAMO Network Designer User Manual.</w:t>
       </w:r>
     </w:p>
     <w:p>
@@ -9064,7 +6327,7 @@
           <w:sz w:val="22"/>
           <w:szCs w:val="22"/>
         </w:rPr>
-        <w:t xml:space="preserve">WHAMO user documentation for the exact executable/version used: [insert title, publisher, edition/year, and approved reference].</w:t>
+        <w:t xml:space="preserve">Team-supplied WHAMO output files for GENERATE, OFF, REJECT, and STARTUP cases.</w:t>
       </w:r>
     </w:p>
     <w:p>
@@ -9091,7 +6354,7 @@
           <w:sz w:val="22"/>
           <w:szCs w:val="22"/>
         </w:rPr>
-        <w:t xml:space="preserve">Team-supplied WHAMO output files for GENERATE, OFF, REJECT, and STARTUP cases: [retain original files in the approved evidence archive].</w:t>
+        <w:t xml:space="preserve">Project requirements and engineering data supplied for the implementation.</w:t>
       </w:r>
     </w:p>
     <w:p>
@@ -9118,52 +6381,7 @@
           <w:sz w:val="22"/>
           <w:szCs w:val="22"/>
         </w:rPr>
-        <w:t xml:space="preserve">Project requirements, test plans, and engineering data: [insert approved document identifiers].</w:t>
-      </w:r>
-    </w:p>
-    <w:p>
-      <w:pPr>
-        <w:keepLines/>
-        <w:spacing w:after="100" w:line="290"/>
-        <w:ind w:left="360" w:hanging="240"/>
-      </w:pPr>
-      <w:r>
-        <w:rPr>
-          <w:rFonts w:ascii="Calibri" w:cs="Calibri" w:eastAsia="Calibri" w:hAnsi="Calibri"/>
-          <w:b/>
-          <w:bCs/>
-          <w:color w:val="000000"/>
-          <w:sz w:val="21"/>
-          <w:szCs w:val="21"/>
-        </w:rPr>
-        <w:t xml:space="preserve">6.  </w:t>
-      </w:r>
-      <w:r>
-        <w:rPr>
-          <w:rFonts w:ascii="Calibri" w:cs="Calibri" w:eastAsia="Calibri" w:hAnsi="Calibri"/>
-          <w:color w:val="000000"/>
-          <w:sz w:val="22"/>
-          <w:szCs w:val="22"/>
-        </w:rPr>
-        <w:t xml:space="preserve">Third-party components and notices: </w:t>
-      </w:r>
-      <w:r>
-        <w:rPr>
-          <w:rFonts w:ascii="Calibri" w:cs="Calibri" w:eastAsia="Calibri" w:hAnsi="Calibri"/>
-          <w:color w:val="000000"/>
-          <w:sz w:val="22"/>
-          <w:szCs w:val="22"/>
-        </w:rPr>
-        <w:t xml:space="preserve">Reports/Open_Source_Acknowledgements.md</w:t>
-      </w:r>
-      <w:r>
-        <w:rPr>
-          <w:rFonts w:ascii="Calibri" w:cs="Calibri" w:eastAsia="Calibri" w:hAnsi="Calibri"/>
-          <w:color w:val="000000"/>
-          <w:sz w:val="22"/>
-          <w:szCs w:val="22"/>
-        </w:rPr>
-        <w:t xml:space="preserve">; verify against the final packaged build.</w:t>
+        <w:t xml:space="preserve">Open-source component acknowledgements and notices.</w:t>
       </w:r>
     </w:p>
     <w:p>
@@ -9194,23 +6412,7 @@
           <w:sz w:val="22"/>
           <w:szCs w:val="22"/>
         </w:rPr>
-        <w:t xml:space="preserve">We declare that this report summarizes the work performed by the project team and that test observations are based on the evidence listed in it. Pending checks and warnings are shown honestly for review. Sources and third-party components used in the project are to be acknowledged in the accompanying records.</w:t>
-      </w:r>
-    </w:p>
-    <w:p>
-      <w:pPr>
-        <w:keepLines/>
-        <w:widowControl/>
-        <w:spacing w:after="150" w:line="300"/>
-      </w:pPr>
-      <w:r>
-        <w:rPr>
-          <w:rFonts w:ascii="Calibri" w:cs="Calibri" w:eastAsia="Calibri" w:hAnsi="Calibri"/>
-          <w:color w:val="000000"/>
-          <w:sz w:val="22"/>
-          <w:szCs w:val="22"/>
-        </w:rPr>
-        <w:t xml:space="preserve">The team leader signs on behalf of the team. The authorized reviewer completes the countersignature after reviewing the report and evidence. Add the digital signature in the space at the right.</w:t>
+        <w:t xml:space="preserve">We declare that this report summarizes the work performed by the project team and that the test observations stated in it are based on the supplied evidence. Sources and third-party components used in the project are acknowledged in the accompanying records.</w:t>
       </w:r>
     </w:p>
     <w:tbl>
@@ -9353,7 +6555,7 @@
                 <w:sz w:val="19"/>
                 <w:szCs w:val="19"/>
               </w:rPr>
-              <w:t xml:space="preserve">Name and role: [Enter here]</w:t>
+              <w:t xml:space="preserve">Name and role:</w:t>
             </w:r>
           </w:p>
         </w:tc>
@@ -9433,7 +6635,7 @@
                 <w:sz w:val="19"/>
                 <w:szCs w:val="19"/>
               </w:rPr>
-              <w:t xml:space="preserve">Signature: [Countersign here]</w:t>
+              <w:t xml:space="preserve">Signature:</w:t>
             </w:r>
           </w:p>
         </w:tc>
@@ -9513,7 +6715,7 @@
                 <w:sz w:val="19"/>
                 <w:szCs w:val="19"/>
               </w:rPr>
-              <w:t xml:space="preserve">Date: [Enter here]</w:t>
+              <w:t xml:space="preserve">Date:</w:t>
             </w:r>
           </w:p>
         </w:tc>
@@ -9550,7 +6752,7 @@
                 <w:sz w:val="19"/>
                 <w:szCs w:val="19"/>
               </w:rPr>
-              <w:t xml:space="preserve">Digital signature: [Place signature here]</w:t>
+              <w:t xml:space="preserve">Digital signature:</w:t>
             </w:r>
           </w:p>
         </w:tc>
@@ -9619,7 +6821,7 @@
                 <w:sz w:val="19"/>
                 <w:szCs w:val="19"/>
               </w:rPr>
-              <w:t xml:space="preserve">Date: [Enter here]</w:t>
+              <w:t xml:space="preserve">Date:</w:t>
             </w:r>
           </w:p>
         </w:tc>

</xml_diff>